<commit_message>
updated with code generation
</commit_message>
<xml_diff>
--- a/Summary/CVCreationUsingLLM_Project_Report.docx
+++ b/Summary/CVCreationUsingLLM_Project_Report.docx
@@ -36,7 +36,7 @@
           <w:rFonts w:ascii="Calibri" w:hAnsi="Calibri"/>
           <w:sz w:val="20"/>
         </w:rPr>
-        <w:t>This capstone project presents a dual-LLM system for generating tailored, ATS-optimized CVs using OpenAI's GPT-4o-mini and GPT-4o models with LangChain orchestration. The system automates resume extraction from unstructured documents, parses job requirements, strategically aligns candidate profiles, and generates optimized resumes with real-time ATS feedback. Implemented across seven specialized Python modules, the system delivers four core features: resume extraction, job parsing, intelligent resume generation, and iterative revision. Key outcomes include a fully operational end-to-end workflow, an ATS scoring system (0-100 scale), multi-format export capabilities (PDF/DOCX), and a modular architecture enabling independent feature usage.</w:t>
+        <w:t>This capstone project presents a dual-LLM system for generating tailored, ATS-optimized CVs using OpenAI's GPT-4o-mini and GPT-4o models with LangChain orchestration. The system automates resume extraction from unstructured documents, parses job requirements, strategically aligns candidate profiles, and generates optimized resumes with real-time ATS feedback. The latest implementation adds semantic similarity scoring using OpenAI embeddings (text-embedding-3-small) for both profile-job matching and ATS keyword analysis, improving detection of related skills beyond exact keyword overlap. This report also captures architecture decisions and engineering trade-offs across model selection, chunking strategy, embedding choice, and regex-vs-semantic matching design.</w:t>
       </w:r>
     </w:p>
     <w:p>
@@ -121,6 +121,7 @@
       <w:r>
         <w:rPr>
           <w:rFonts w:ascii="Calibri" w:hAnsi="Calibri"/>
+          <w:sz w:val="20"/>
         </w:rPr>
         <w:t>Automated resume extraction from PDF/DOCX/TXT</w:t>
       </w:r>
@@ -132,6 +133,7 @@
       <w:r>
         <w:rPr>
           <w:rFonts w:ascii="Calibri" w:hAnsi="Calibri"/>
+          <w:sz w:val="20"/>
         </w:rPr>
         <w:t>Intelligent job description parsing</w:t>
       </w:r>
@@ -143,6 +145,7 @@
       <w:r>
         <w:rPr>
           <w:rFonts w:ascii="Calibri" w:hAnsi="Calibri"/>
+          <w:sz w:val="20"/>
         </w:rPr>
         <w:t>Strategic resume generation (2-step process)</w:t>
       </w:r>
@@ -154,6 +157,7 @@
       <w:r>
         <w:rPr>
           <w:rFonts w:ascii="Calibri" w:hAnsi="Calibri"/>
+          <w:sz w:val="20"/>
         </w:rPr>
         <w:t>Iterative revision with ATS feedback</w:t>
       </w:r>
@@ -165,6 +169,7 @@
       <w:r>
         <w:rPr>
           <w:rFonts w:ascii="Calibri" w:hAnsi="Calibri"/>
+          <w:sz w:val="20"/>
         </w:rPr>
         <w:t>ATS scoring system (0-100 scale)</w:t>
       </w:r>
@@ -176,6 +181,19 @@
       <w:r>
         <w:rPr>
           <w:rFonts w:ascii="Calibri" w:hAnsi="Calibri"/>
+          <w:sz w:val="20"/>
+        </w:rPr>
+        <w:t>Semantic keyword matching using embeddings</w:t>
+      </w:r>
+    </w:p>
+    <w:p>
+      <w:pPr>
+        <w:pStyle w:val="ListBullet"/>
+      </w:pPr>
+      <w:r>
+        <w:rPr>
+          <w:rFonts w:ascii="Calibri" w:hAnsi="Calibri"/>
+          <w:sz w:val="20"/>
         </w:rPr>
         <w:t>Multi-format export (PDF/DOCX)</w:t>
       </w:r>
@@ -187,6 +205,7 @@
       <w:r>
         <w:rPr>
           <w:rFonts w:ascii="Calibri" w:hAnsi="Calibri"/>
+          <w:sz w:val="20"/>
         </w:rPr>
         <w:t>Modular, scalable architecture</w:t>
       </w:r>
@@ -198,6 +217,7 @@
       <w:r>
         <w:rPr>
           <w:rFonts w:ascii="Calibri" w:hAnsi="Calibri"/>
+          <w:sz w:val="20"/>
         </w:rPr>
         <w:t>Profile-job matching assessment</w:t>
       </w:r>
@@ -209,6 +229,7 @@
       <w:r>
         <w:rPr>
           <w:rFonts w:ascii="Calibri" w:hAnsi="Calibri"/>
+          <w:sz w:val="20"/>
         </w:rPr>
         <w:t>Intuitive menu-driven interface</w:t>
       </w:r>
@@ -220,6 +241,7 @@
       <w:r>
         <w:rPr>
           <w:rFonts w:ascii="Calibri" w:hAnsi="Calibri"/>
+          <w:sz w:val="20"/>
         </w:rPr>
         <w:t>Cost-optimized LLM orchestration</w:t>
       </w:r>
@@ -255,7 +277,7 @@
         <w:rPr>
           <w:rFonts w:ascii="Calibri" w:hAnsi="Calibri"/>
         </w:rPr>
-        <w:t>LangChain 0.1.0+</w:t>
+        <w:t>LangChain &gt;=1.2.13 (with langchain-community and langchain-openai)</w:t>
       </w:r>
     </w:p>
     <w:p>
@@ -267,6 +289,17 @@
           <w:rFonts w:ascii="Calibri" w:hAnsi="Calibri"/>
         </w:rPr>
         <w:t>GPT-4o-mini (extraction), GPT-4o (generation)</w:t>
+      </w:r>
+    </w:p>
+    <w:p>
+      <w:pPr>
+        <w:pStyle w:val="ListBullet2"/>
+      </w:pPr>
+      <w:r>
+        <w:rPr>
+          <w:rFonts w:ascii="Calibri" w:hAnsi="Calibri"/>
+        </w:rPr>
+        <w:t>OpenAI text-embedding-3-small (semantic similarity)</w:t>
       </w:r>
     </w:p>
     <w:p>
@@ -308,6 +341,7 @@
       <w:r>
         <w:rPr>
           <w:rFonts w:ascii="Calibri" w:hAnsi="Calibri"/>
+          <w:sz w:val="20"/>
         </w:rPr>
         <w:t>extractor.py: Resume extraction (Multi-format support)</w:t>
       </w:r>
@@ -319,6 +353,7 @@
       <w:r>
         <w:rPr>
           <w:rFonts w:ascii="Calibri" w:hAnsi="Calibri"/>
+          <w:sz w:val="20"/>
         </w:rPr>
         <w:t>parser.py: Job parsing (Keyword identification)</w:t>
       </w:r>
@@ -330,6 +365,7 @@
       <w:r>
         <w:rPr>
           <w:rFonts w:ascii="Calibri" w:hAnsi="Calibri"/>
+          <w:sz w:val="20"/>
         </w:rPr>
         <w:t>generator.py: Resume generation (Two-step process)</w:t>
       </w:r>
@@ -341,6 +377,7 @@
       <w:r>
         <w:rPr>
           <w:rFonts w:ascii="Calibri" w:hAnsi="Calibri"/>
+          <w:sz w:val="20"/>
         </w:rPr>
         <w:t>reviser.py: Iterative refinement (User edit integration)</w:t>
       </w:r>
@@ -352,8 +389,9 @@
       <w:r>
         <w:rPr>
           <w:rFonts w:ascii="Calibri" w:hAnsi="Calibri"/>
+          <w:sz w:val="20"/>
         </w:rPr>
-        <w:t>ats_checker.py: ATS scoring (0-100 scale evaluation)</w:t>
+        <w:t>ats_checker.py: ATS scoring (Semantic keyword evaluation (0-100 scale))</w:t>
       </w:r>
     </w:p>
     <w:p>
@@ -363,8 +401,9 @@
       <w:r>
         <w:rPr>
           <w:rFonts w:ascii="Calibri" w:hAnsi="Calibri"/>
+          <w:sz w:val="20"/>
         </w:rPr>
-        <w:t>matcher.py: Profile-job matching (Gap analysis)</w:t>
+        <w:t>matcher.py: Profile-job matching (Embedding-based gap analysis)</w:t>
       </w:r>
     </w:p>
     <w:p>
@@ -374,6 +413,7 @@
       <w:r>
         <w:rPr>
           <w:rFonts w:ascii="Calibri" w:hAnsi="Calibri"/>
+          <w:sz w:val="20"/>
         </w:rPr>
         <w:t>formatters.py: PDF/DOCX export (Professional formatting)</w:t>
       </w:r>
@@ -385,8 +425,14 @@
       <w:r>
         <w:rPr>
           <w:rFonts w:ascii="Calibri" w:hAnsi="Calibri"/>
+          <w:sz w:val="20"/>
         </w:rPr>
         <w:t>main.py: Orchestration (Complete workflow)</w:t>
+      </w:r>
+    </w:p>
+    <w:p>
+      <w:r>
+        <w:br w:type="page"/>
       </w:r>
     </w:p>
     <w:p>
@@ -397,7 +443,1590 @@
         <w:rPr>
           <w:rFonts w:ascii="Calibri" w:hAnsi="Calibri"/>
         </w:rPr>
-        <w:t>5. Results and Analysis</w:t>
+        <w:t>5. System Architecture</w:t>
+      </w:r>
+    </w:p>
+    <w:p>
+      <w:r>
+        <w:rPr>
+          <w:rFonts w:ascii="Calibri" w:hAnsi="Calibri"/>
+          <w:sz w:val="20"/>
+        </w:rPr>
+        <w:t>The system follows a pipeline-plus-feedback architecture. Inputs are parsed into structured JSON, scored for fit and ATS compatibility, then iteratively refined before final export.</w:t>
+      </w:r>
+    </w:p>
+    <w:p>
+      <w:r>
+        <w:rPr>
+          <w:rFonts w:ascii="Calibri" w:hAnsi="Calibri"/>
+          <w:b/>
+        </w:rPr>
+        <w:t>Architecture Diagram:</w:t>
+      </w:r>
+    </w:p>
+    <w:p>
+      <w:r>
+        <w:rPr>
+          <w:rFonts w:ascii="Courier New" w:hAnsi="Courier New"/>
+          <w:sz w:val="16"/>
+        </w:rPr>
+        <w:t>+----------------------+      +----------------------+</w:t>
+      </w:r>
+    </w:p>
+    <w:p>
+      <w:r>
+        <w:rPr>
+          <w:rFonts w:ascii="Courier New" w:hAnsi="Courier New"/>
+          <w:sz w:val="16"/>
+        </w:rPr>
+        <w:t>| Resume (PDF/DOCX/TXT)|      | Job Description (TXT)|</w:t>
+      </w:r>
+    </w:p>
+    <w:p>
+      <w:r>
+        <w:rPr>
+          <w:rFonts w:ascii="Courier New" w:hAnsi="Courier New"/>
+          <w:sz w:val="16"/>
+        </w:rPr>
+        <w:t>+----------+-----------+      +----------+-----------+</w:t>
+      </w:r>
+    </w:p>
+    <w:p>
+      <w:r>
+        <w:rPr>
+          <w:rFonts w:ascii="Courier New" w:hAnsi="Courier New"/>
+          <w:sz w:val="16"/>
+        </w:rPr>
+        <w:t xml:space="preserve">           |                             |</w:t>
+      </w:r>
+    </w:p>
+    <w:p>
+      <w:r>
+        <w:rPr>
+          <w:rFonts w:ascii="Courier New" w:hAnsi="Courier New"/>
+          <w:sz w:val="16"/>
+        </w:rPr>
+        <w:t xml:space="preserve">     extractor.py                   parser.py</w:t>
+      </w:r>
+    </w:p>
+    <w:p>
+      <w:r>
+        <w:rPr>
+          <w:rFonts w:ascii="Courier New" w:hAnsi="Courier New"/>
+          <w:sz w:val="16"/>
+        </w:rPr>
+        <w:t xml:space="preserve">           +-------------+  +------------+</w:t>
+      </w:r>
+    </w:p>
+    <w:p>
+      <w:r>
+        <w:rPr>
+          <w:rFonts w:ascii="Courier New" w:hAnsi="Courier New"/>
+          <w:sz w:val="16"/>
+        </w:rPr>
+        <w:t xml:space="preserve">                         v  v</w:t>
+      </w:r>
+    </w:p>
+    <w:p>
+      <w:r>
+        <w:rPr>
+          <w:rFonts w:ascii="Courier New" w:hAnsi="Courier New"/>
+          <w:sz w:val="16"/>
+        </w:rPr>
+        <w:t xml:space="preserve">                    main.py (workflow)</w:t>
+      </w:r>
+    </w:p>
+    <w:p>
+      <w:r>
+        <w:rPr>
+          <w:rFonts w:ascii="Courier New" w:hAnsi="Courier New"/>
+          <w:sz w:val="16"/>
+        </w:rPr>
+        <w:t xml:space="preserve">                         |</w:t>
+      </w:r>
+    </w:p>
+    <w:p>
+      <w:r>
+        <w:rPr>
+          <w:rFonts w:ascii="Courier New" w:hAnsi="Courier New"/>
+          <w:sz w:val="16"/>
+        </w:rPr>
+        <w:t xml:space="preserve">                     matcher.py</w:t>
+      </w:r>
+    </w:p>
+    <w:p>
+      <w:r>
+        <w:rPr>
+          <w:rFonts w:ascii="Courier New" w:hAnsi="Courier New"/>
+          <w:sz w:val="16"/>
+        </w:rPr>
+        <w:t xml:space="preserve">                         |</w:t>
+      </w:r>
+    </w:p>
+    <w:p>
+      <w:r>
+        <w:rPr>
+          <w:rFonts w:ascii="Courier New" w:hAnsi="Courier New"/>
+          <w:sz w:val="16"/>
+        </w:rPr>
+        <w:t xml:space="preserve">                    generator.py</w:t>
+      </w:r>
+    </w:p>
+    <w:p>
+      <w:r>
+        <w:rPr>
+          <w:rFonts w:ascii="Courier New" w:hAnsi="Courier New"/>
+          <w:sz w:val="16"/>
+        </w:rPr>
+        <w:t xml:space="preserve">                         |</w:t>
+      </w:r>
+    </w:p>
+    <w:p>
+      <w:r>
+        <w:rPr>
+          <w:rFonts w:ascii="Courier New" w:hAnsi="Courier New"/>
+          <w:sz w:val="16"/>
+        </w:rPr>
+        <w:t xml:space="preserve">           +-------------+-------------+</w:t>
+      </w:r>
+    </w:p>
+    <w:p>
+      <w:r>
+        <w:rPr>
+          <w:rFonts w:ascii="Courier New" w:hAnsi="Courier New"/>
+          <w:sz w:val="16"/>
+        </w:rPr>
+        <w:t xml:space="preserve">           |                           |</w:t>
+      </w:r>
+    </w:p>
+    <w:p>
+      <w:r>
+        <w:rPr>
+          <w:rFonts w:ascii="Courier New" w:hAnsi="Courier New"/>
+          <w:sz w:val="16"/>
+        </w:rPr>
+        <w:t xml:space="preserve">     ats_checker.py &lt;---- reviser.py (loop)</w:t>
+      </w:r>
+    </w:p>
+    <w:p>
+      <w:r>
+        <w:rPr>
+          <w:rFonts w:ascii="Courier New" w:hAnsi="Courier New"/>
+          <w:sz w:val="16"/>
+        </w:rPr>
+        <w:t xml:space="preserve">           |</w:t>
+      </w:r>
+    </w:p>
+    <w:p>
+      <w:r>
+        <w:rPr>
+          <w:rFonts w:ascii="Courier New" w:hAnsi="Courier New"/>
+          <w:sz w:val="16"/>
+        </w:rPr>
+        <w:t xml:space="preserve">      formatters.py</w:t>
+      </w:r>
+    </w:p>
+    <w:p>
+      <w:r>
+        <w:rPr>
+          <w:rFonts w:ascii="Courier New" w:hAnsi="Courier New"/>
+          <w:sz w:val="16"/>
+        </w:rPr>
+        <w:t xml:space="preserve">           |</w:t>
+      </w:r>
+    </w:p>
+    <w:p>
+      <w:r>
+        <w:rPr>
+          <w:rFonts w:ascii="Courier New" w:hAnsi="Courier New"/>
+          <w:sz w:val="16"/>
+        </w:rPr>
+        <w:t>+----------v---------------------------+</w:t>
+      </w:r>
+    </w:p>
+    <w:p>
+      <w:r>
+        <w:rPr>
+          <w:rFonts w:ascii="Courier New" w:hAnsi="Courier New"/>
+          <w:sz w:val="16"/>
+        </w:rPr>
+        <w:t>| Tailored Resume Output (PDF/DOCX/JSON)|</w:t>
+      </w:r>
+    </w:p>
+    <w:p>
+      <w:r>
+        <w:rPr>
+          <w:rFonts w:ascii="Courier New" w:hAnsi="Courier New"/>
+          <w:sz w:val="16"/>
+        </w:rPr>
+        <w:t>+---------------------------------------+</w:t>
+      </w:r>
+    </w:p>
+    <w:p>
+      <w:r>
+        <w:rPr>
+          <w:rFonts w:ascii="Calibri" w:hAnsi="Calibri"/>
+          <w:b/>
+        </w:rPr>
+        <w:t>Component Interaction Notes:</w:t>
+      </w:r>
+    </w:p>
+    <w:p>
+      <w:pPr>
+        <w:pStyle w:val="ListBullet"/>
+      </w:pPr>
+      <w:r>
+        <w:rPr>
+          <w:rFonts w:ascii="Calibri" w:hAnsi="Calibri"/>
+          <w:sz w:val="20"/>
+        </w:rPr>
+        <w:t>extractor.py converts unstructured resume content into normalized profile JSON.</w:t>
+      </w:r>
+    </w:p>
+    <w:p>
+      <w:pPr>
+        <w:pStyle w:val="ListBullet"/>
+      </w:pPr>
+      <w:r>
+        <w:rPr>
+          <w:rFonts w:ascii="Calibri" w:hAnsi="Calibri"/>
+          <w:sz w:val="20"/>
+        </w:rPr>
+        <w:t>parser.py structures the target job description into requirements and keywords.</w:t>
+      </w:r>
+    </w:p>
+    <w:p>
+      <w:pPr>
+        <w:pStyle w:val="ListBullet"/>
+      </w:pPr>
+      <w:r>
+        <w:rPr>
+          <w:rFonts w:ascii="Calibri" w:hAnsi="Calibri"/>
+          <w:sz w:val="20"/>
+        </w:rPr>
+        <w:t>main.py orchestrates feature execution and handles the interactive menu flow.</w:t>
+      </w:r>
+    </w:p>
+    <w:p>
+      <w:pPr>
+        <w:pStyle w:val="ListBullet"/>
+      </w:pPr>
+      <w:r>
+        <w:rPr>
+          <w:rFonts w:ascii="Calibri" w:hAnsi="Calibri"/>
+          <w:sz w:val="20"/>
+        </w:rPr>
+        <w:t>matcher.py computes profile-to-job alignment before generation.</w:t>
+      </w:r>
+    </w:p>
+    <w:p>
+      <w:pPr>
+        <w:pStyle w:val="ListBullet"/>
+      </w:pPr>
+      <w:r>
+        <w:rPr>
+          <w:rFonts w:ascii="Calibri" w:hAnsi="Calibri"/>
+          <w:sz w:val="20"/>
+        </w:rPr>
+        <w:t>generator.py runs strategic analysis then tailored resume synthesis.</w:t>
+      </w:r>
+    </w:p>
+    <w:p>
+      <w:pPr>
+        <w:pStyle w:val="ListBullet"/>
+      </w:pPr>
+      <w:r>
+        <w:rPr>
+          <w:rFonts w:ascii="Calibri" w:hAnsi="Calibri"/>
+          <w:sz w:val="20"/>
+        </w:rPr>
+        <w:t>ats_checker.py computes ATS score and semantic keyword coverage.</w:t>
+      </w:r>
+    </w:p>
+    <w:p>
+      <w:pPr>
+        <w:pStyle w:val="ListBullet"/>
+      </w:pPr>
+      <w:r>
+        <w:rPr>
+          <w:rFonts w:ascii="Calibri" w:hAnsi="Calibri"/>
+          <w:sz w:val="20"/>
+        </w:rPr>
+        <w:t>reviser.py applies user edits and re-runs ATS checks in a feedback loop.</w:t>
+      </w:r>
+    </w:p>
+    <w:p>
+      <w:pPr>
+        <w:pStyle w:val="ListBullet"/>
+      </w:pPr>
+      <w:r>
+        <w:rPr>
+          <w:rFonts w:ascii="Calibri" w:hAnsi="Calibri"/>
+          <w:sz w:val="20"/>
+        </w:rPr>
+        <w:t>formatters.py exports final resumes to human-readable PDF and DOCX.</w:t>
+      </w:r>
+    </w:p>
+    <w:p>
+      <w:r>
+        <w:br w:type="page"/>
+      </w:r>
+    </w:p>
+    <w:p>
+      <w:pPr>
+        <w:pStyle w:val="Heading2"/>
+      </w:pPr>
+      <w:r>
+        <w:rPr>
+          <w:rFonts w:ascii="Calibri" w:hAnsi="Calibri"/>
+        </w:rPr>
+        <w:t>6. LLM Model Selection Trade-offs (Pros &amp; Cons)</w:t>
+      </w:r>
+    </w:p>
+    <w:tbl>
+      <w:tblPr>
+        <w:tblStyle w:val="TableGrid"/>
+        <w:tblW w:type="auto" w:w="0"/>
+        <w:tblLook w:firstColumn="1" w:firstRow="1" w:lastColumn="0" w:lastRow="0" w:noHBand="0" w:noVBand="1" w:val="04A0"/>
+      </w:tblPr>
+      <w:tblGrid>
+        <w:gridCol w:w="2160"/>
+        <w:gridCol w:w="2160"/>
+        <w:gridCol w:w="2160"/>
+        <w:gridCol w:w="2160"/>
+      </w:tblGrid>
+      <w:tr>
+        <w:tc>
+          <w:tcPr>
+            <w:tcW w:type="dxa" w:w="2160"/>
+          </w:tcPr>
+          <w:p>
+            <w:r>
+              <w:rPr>
+                <w:rFonts w:ascii="Calibri" w:hAnsi="Calibri"/>
+                <w:b/>
+                <w:sz w:val="20"/>
+              </w:rPr>
+              <w:t>Option</w:t>
+            </w:r>
+          </w:p>
+        </w:tc>
+        <w:tc>
+          <w:tcPr>
+            <w:tcW w:type="dxa" w:w="2160"/>
+          </w:tcPr>
+          <w:p>
+            <w:r>
+              <w:rPr>
+                <w:rFonts w:ascii="Calibri" w:hAnsi="Calibri"/>
+                <w:b/>
+                <w:sz w:val="20"/>
+              </w:rPr>
+              <w:t>Pros</w:t>
+            </w:r>
+          </w:p>
+        </w:tc>
+        <w:tc>
+          <w:tcPr>
+            <w:tcW w:type="dxa" w:w="2160"/>
+          </w:tcPr>
+          <w:p>
+            <w:r>
+              <w:rPr>
+                <w:rFonts w:ascii="Calibri" w:hAnsi="Calibri"/>
+                <w:b/>
+                <w:sz w:val="20"/>
+              </w:rPr>
+              <w:t>Cons</w:t>
+            </w:r>
+          </w:p>
+        </w:tc>
+        <w:tc>
+          <w:tcPr>
+            <w:tcW w:type="dxa" w:w="2160"/>
+          </w:tcPr>
+          <w:p>
+            <w:r>
+              <w:rPr>
+                <w:rFonts w:ascii="Calibri" w:hAnsi="Calibri"/>
+                <w:b/>
+                <w:sz w:val="20"/>
+              </w:rPr>
+              <w:t>Best Fit</w:t>
+            </w:r>
+          </w:p>
+        </w:tc>
+      </w:tr>
+      <w:tr>
+        <w:tc>
+          <w:tcPr>
+            <w:tcW w:type="dxa" w:w="2160"/>
+          </w:tcPr>
+          <w:p>
+            <w:r>
+              <w:rPr>
+                <w:rFonts w:ascii="Calibri" w:hAnsi="Calibri"/>
+                <w:b w:val="0"/>
+                <w:sz w:val="20"/>
+              </w:rPr>
+              <w:t>GPT-4o-mini</w:t>
+            </w:r>
+          </w:p>
+        </w:tc>
+        <w:tc>
+          <w:tcPr>
+            <w:tcW w:type="dxa" w:w="2160"/>
+          </w:tcPr>
+          <w:p>
+            <w:r>
+              <w:rPr>
+                <w:rFonts w:ascii="Calibri" w:hAnsi="Calibri"/>
+                <w:b w:val="0"/>
+                <w:sz w:val="20"/>
+              </w:rPr>
+              <w:t>Lower cost; lower latency; good for extraction and parsing tasks.</w:t>
+            </w:r>
+          </w:p>
+        </w:tc>
+        <w:tc>
+          <w:tcPr>
+            <w:tcW w:type="dxa" w:w="2160"/>
+          </w:tcPr>
+          <w:p>
+            <w:r>
+              <w:rPr>
+                <w:rFonts w:ascii="Calibri" w:hAnsi="Calibri"/>
+                <w:b w:val="0"/>
+                <w:sz w:val="20"/>
+              </w:rPr>
+              <w:t>Lower generation depth; weaker on nuanced phrasing for final resumes.</w:t>
+            </w:r>
+          </w:p>
+        </w:tc>
+        <w:tc>
+          <w:tcPr>
+            <w:tcW w:type="dxa" w:w="2160"/>
+          </w:tcPr>
+          <w:p>
+            <w:r>
+              <w:rPr>
+                <w:rFonts w:ascii="Calibri" w:hAnsi="Calibri"/>
+                <w:b w:val="0"/>
+                <w:sz w:val="20"/>
+              </w:rPr>
+              <w:t>High-volume structured preprocessing</w:t>
+            </w:r>
+          </w:p>
+        </w:tc>
+      </w:tr>
+      <w:tr>
+        <w:tc>
+          <w:tcPr>
+            <w:tcW w:type="dxa" w:w="2160"/>
+          </w:tcPr>
+          <w:p>
+            <w:r>
+              <w:rPr>
+                <w:rFonts w:ascii="Calibri" w:hAnsi="Calibri"/>
+                <w:b w:val="0"/>
+                <w:sz w:val="20"/>
+              </w:rPr>
+              <w:t>GPT-4o</w:t>
+            </w:r>
+          </w:p>
+        </w:tc>
+        <w:tc>
+          <w:tcPr>
+            <w:tcW w:type="dxa" w:w="2160"/>
+          </w:tcPr>
+          <w:p>
+            <w:r>
+              <w:rPr>
+                <w:rFonts w:ascii="Calibri" w:hAnsi="Calibri"/>
+                <w:b w:val="0"/>
+                <w:sz w:val="20"/>
+              </w:rPr>
+              <w:t>Higher quality synthesis; stronger reasoning for strategic tailoring.</w:t>
+            </w:r>
+          </w:p>
+        </w:tc>
+        <w:tc>
+          <w:tcPr>
+            <w:tcW w:type="dxa" w:w="2160"/>
+          </w:tcPr>
+          <w:p>
+            <w:r>
+              <w:rPr>
+                <w:rFonts w:ascii="Calibri" w:hAnsi="Calibri"/>
+                <w:b w:val="0"/>
+                <w:sz w:val="20"/>
+              </w:rPr>
+              <w:t>Higher cost; slower response time compared to mini model.</w:t>
+            </w:r>
+          </w:p>
+        </w:tc>
+        <w:tc>
+          <w:tcPr>
+            <w:tcW w:type="dxa" w:w="2160"/>
+          </w:tcPr>
+          <w:p>
+            <w:r>
+              <w:rPr>
+                <w:rFonts w:ascii="Calibri" w:hAnsi="Calibri"/>
+                <w:b w:val="0"/>
+                <w:sz w:val="20"/>
+              </w:rPr>
+              <w:t>Final resume generation and refinement</w:t>
+            </w:r>
+          </w:p>
+        </w:tc>
+      </w:tr>
+      <w:tr>
+        <w:tc>
+          <w:tcPr>
+            <w:tcW w:type="dxa" w:w="2160"/>
+          </w:tcPr>
+          <w:p>
+            <w:r>
+              <w:rPr>
+                <w:rFonts w:ascii="Calibri" w:hAnsi="Calibri"/>
+                <w:b w:val="0"/>
+                <w:sz w:val="20"/>
+              </w:rPr>
+              <w:t>Dual-Model (Current)</w:t>
+            </w:r>
+          </w:p>
+        </w:tc>
+        <w:tc>
+          <w:tcPr>
+            <w:tcW w:type="dxa" w:w="2160"/>
+          </w:tcPr>
+          <w:p>
+            <w:r>
+              <w:rPr>
+                <w:rFonts w:ascii="Calibri" w:hAnsi="Calibri"/>
+                <w:b w:val="0"/>
+                <w:sz w:val="20"/>
+              </w:rPr>
+              <w:t>Balanced cost/performance; quality where needed, efficiency elsewhere.</w:t>
+            </w:r>
+          </w:p>
+        </w:tc>
+        <w:tc>
+          <w:tcPr>
+            <w:tcW w:type="dxa" w:w="2160"/>
+          </w:tcPr>
+          <w:p>
+            <w:r>
+              <w:rPr>
+                <w:rFonts w:ascii="Calibri" w:hAnsi="Calibri"/>
+                <w:b w:val="0"/>
+                <w:sz w:val="20"/>
+              </w:rPr>
+              <w:t>More orchestration complexity and model-boundary design overhead.</w:t>
+            </w:r>
+          </w:p>
+        </w:tc>
+        <w:tc>
+          <w:tcPr>
+            <w:tcW w:type="dxa" w:w="2160"/>
+          </w:tcPr>
+          <w:p>
+            <w:r>
+              <w:rPr>
+                <w:rFonts w:ascii="Calibri" w:hAnsi="Calibri"/>
+                <w:b w:val="0"/>
+                <w:sz w:val="20"/>
+              </w:rPr>
+              <w:t>Production pipeline with quality and budget constraints</w:t>
+            </w:r>
+          </w:p>
+        </w:tc>
+      </w:tr>
+    </w:tbl>
+    <w:p/>
+    <w:p>
+      <w:pPr>
+        <w:pStyle w:val="Heading2"/>
+      </w:pPr>
+      <w:r>
+        <w:rPr>
+          <w:rFonts w:ascii="Calibri" w:hAnsi="Calibri"/>
+        </w:rPr>
+        <w:t>7. Chunking Strategy Trade-offs (Pros &amp; Cons)</w:t>
+      </w:r>
+    </w:p>
+    <w:tbl>
+      <w:tblPr>
+        <w:tblStyle w:val="TableGrid"/>
+        <w:tblW w:type="auto" w:w="0"/>
+        <w:tblLook w:firstColumn="1" w:firstRow="1" w:lastColumn="0" w:lastRow="0" w:noHBand="0" w:noVBand="1" w:val="04A0"/>
+      </w:tblPr>
+      <w:tblGrid>
+        <w:gridCol w:w="2160"/>
+        <w:gridCol w:w="2160"/>
+        <w:gridCol w:w="2160"/>
+        <w:gridCol w:w="2160"/>
+      </w:tblGrid>
+      <w:tr>
+        <w:tc>
+          <w:tcPr>
+            <w:tcW w:type="dxa" w:w="2160"/>
+          </w:tcPr>
+          <w:p>
+            <w:r>
+              <w:rPr>
+                <w:rFonts w:ascii="Calibri" w:hAnsi="Calibri"/>
+                <w:b/>
+                <w:sz w:val="20"/>
+              </w:rPr>
+              <w:t>Option</w:t>
+            </w:r>
+          </w:p>
+        </w:tc>
+        <w:tc>
+          <w:tcPr>
+            <w:tcW w:type="dxa" w:w="2160"/>
+          </w:tcPr>
+          <w:p>
+            <w:r>
+              <w:rPr>
+                <w:rFonts w:ascii="Calibri" w:hAnsi="Calibri"/>
+                <w:b/>
+                <w:sz w:val="20"/>
+              </w:rPr>
+              <w:t>Pros</w:t>
+            </w:r>
+          </w:p>
+        </w:tc>
+        <w:tc>
+          <w:tcPr>
+            <w:tcW w:type="dxa" w:w="2160"/>
+          </w:tcPr>
+          <w:p>
+            <w:r>
+              <w:rPr>
+                <w:rFonts w:ascii="Calibri" w:hAnsi="Calibri"/>
+                <w:b/>
+                <w:sz w:val="20"/>
+              </w:rPr>
+              <w:t>Cons</w:t>
+            </w:r>
+          </w:p>
+        </w:tc>
+        <w:tc>
+          <w:tcPr>
+            <w:tcW w:type="dxa" w:w="2160"/>
+          </w:tcPr>
+          <w:p>
+            <w:r>
+              <w:rPr>
+                <w:rFonts w:ascii="Calibri" w:hAnsi="Calibri"/>
+                <w:b/>
+                <w:sz w:val="20"/>
+              </w:rPr>
+              <w:t>Best Fit</w:t>
+            </w:r>
+          </w:p>
+        </w:tc>
+      </w:tr>
+      <w:tr>
+        <w:tc>
+          <w:tcPr>
+            <w:tcW w:type="dxa" w:w="2160"/>
+          </w:tcPr>
+          <w:p>
+            <w:r>
+              <w:rPr>
+                <w:rFonts w:ascii="Calibri" w:hAnsi="Calibri"/>
+                <w:b w:val="0"/>
+                <w:sz w:val="20"/>
+              </w:rPr>
+              <w:t>No Chunking</w:t>
+            </w:r>
+          </w:p>
+        </w:tc>
+        <w:tc>
+          <w:tcPr>
+            <w:tcW w:type="dxa" w:w="2160"/>
+          </w:tcPr>
+          <w:p>
+            <w:r>
+              <w:rPr>
+                <w:rFonts w:ascii="Calibri" w:hAnsi="Calibri"/>
+                <w:b w:val="0"/>
+                <w:sz w:val="20"/>
+              </w:rPr>
+              <w:t>Preserves full context in one pass for short documents.</w:t>
+            </w:r>
+          </w:p>
+        </w:tc>
+        <w:tc>
+          <w:tcPr>
+            <w:tcW w:type="dxa" w:w="2160"/>
+          </w:tcPr>
+          <w:p>
+            <w:r>
+              <w:rPr>
+                <w:rFonts w:ascii="Calibri" w:hAnsi="Calibri"/>
+                <w:b w:val="0"/>
+                <w:sz w:val="20"/>
+              </w:rPr>
+              <w:t>Fails on long inputs due to token limits and higher request costs.</w:t>
+            </w:r>
+          </w:p>
+        </w:tc>
+        <w:tc>
+          <w:tcPr>
+            <w:tcW w:type="dxa" w:w="2160"/>
+          </w:tcPr>
+          <w:p>
+            <w:r>
+              <w:rPr>
+                <w:rFonts w:ascii="Calibri" w:hAnsi="Calibri"/>
+                <w:b w:val="0"/>
+                <w:sz w:val="20"/>
+              </w:rPr>
+              <w:t>Short resumes or compact job descriptions</w:t>
+            </w:r>
+          </w:p>
+        </w:tc>
+      </w:tr>
+      <w:tr>
+        <w:tc>
+          <w:tcPr>
+            <w:tcW w:type="dxa" w:w="2160"/>
+          </w:tcPr>
+          <w:p>
+            <w:r>
+              <w:rPr>
+                <w:rFonts w:ascii="Calibri" w:hAnsi="Calibri"/>
+                <w:b w:val="0"/>
+                <w:sz w:val="20"/>
+              </w:rPr>
+              <w:t>Fixed-Size Chunking</w:t>
+            </w:r>
+          </w:p>
+        </w:tc>
+        <w:tc>
+          <w:tcPr>
+            <w:tcW w:type="dxa" w:w="2160"/>
+          </w:tcPr>
+          <w:p>
+            <w:r>
+              <w:rPr>
+                <w:rFonts w:ascii="Calibri" w:hAnsi="Calibri"/>
+                <w:b w:val="0"/>
+                <w:sz w:val="20"/>
+              </w:rPr>
+              <w:t>Simple implementation; predictable token usage and latency.</w:t>
+            </w:r>
+          </w:p>
+        </w:tc>
+        <w:tc>
+          <w:tcPr>
+            <w:tcW w:type="dxa" w:w="2160"/>
+          </w:tcPr>
+          <w:p>
+            <w:r>
+              <w:rPr>
+                <w:rFonts w:ascii="Calibri" w:hAnsi="Calibri"/>
+                <w:b w:val="0"/>
+                <w:sz w:val="20"/>
+              </w:rPr>
+              <w:t>Can split related context across chunk boundaries.</w:t>
+            </w:r>
+          </w:p>
+        </w:tc>
+        <w:tc>
+          <w:tcPr>
+            <w:tcW w:type="dxa" w:w="2160"/>
+          </w:tcPr>
+          <w:p>
+            <w:r>
+              <w:rPr>
+                <w:rFonts w:ascii="Calibri" w:hAnsi="Calibri"/>
+                <w:b w:val="0"/>
+                <w:sz w:val="20"/>
+              </w:rPr>
+              <w:t>Baseline scalable processing</w:t>
+            </w:r>
+          </w:p>
+        </w:tc>
+      </w:tr>
+      <w:tr>
+        <w:tc>
+          <w:tcPr>
+            <w:tcW w:type="dxa" w:w="2160"/>
+          </w:tcPr>
+          <w:p>
+            <w:r>
+              <w:rPr>
+                <w:rFonts w:ascii="Calibri" w:hAnsi="Calibri"/>
+                <w:b w:val="0"/>
+                <w:sz w:val="20"/>
+              </w:rPr>
+              <w:t>Semantic/Section-Aware Chunking</w:t>
+            </w:r>
+          </w:p>
+        </w:tc>
+        <w:tc>
+          <w:tcPr>
+            <w:tcW w:type="dxa" w:w="2160"/>
+          </w:tcPr>
+          <w:p>
+            <w:r>
+              <w:rPr>
+                <w:rFonts w:ascii="Calibri" w:hAnsi="Calibri"/>
+                <w:b w:val="0"/>
+                <w:sz w:val="20"/>
+              </w:rPr>
+              <w:t>Better context preservation; stronger extraction accuracy for long docs.</w:t>
+            </w:r>
+          </w:p>
+        </w:tc>
+        <w:tc>
+          <w:tcPr>
+            <w:tcW w:type="dxa" w:w="2160"/>
+          </w:tcPr>
+          <w:p>
+            <w:r>
+              <w:rPr>
+                <w:rFonts w:ascii="Calibri" w:hAnsi="Calibri"/>
+                <w:b w:val="0"/>
+                <w:sz w:val="20"/>
+              </w:rPr>
+              <w:t>Higher implementation complexity and tuning effort.</w:t>
+            </w:r>
+          </w:p>
+        </w:tc>
+        <w:tc>
+          <w:tcPr>
+            <w:tcW w:type="dxa" w:w="2160"/>
+          </w:tcPr>
+          <w:p>
+            <w:r>
+              <w:rPr>
+                <w:rFonts w:ascii="Calibri" w:hAnsi="Calibri"/>
+                <w:b w:val="0"/>
+                <w:sz w:val="20"/>
+              </w:rPr>
+              <w:t>Quality-sensitive extraction pipelines</w:t>
+            </w:r>
+          </w:p>
+        </w:tc>
+      </w:tr>
+    </w:tbl>
+    <w:p/>
+    <w:p>
+      <w:pPr>
+        <w:pStyle w:val="Heading2"/>
+      </w:pPr>
+      <w:r>
+        <w:rPr>
+          <w:rFonts w:ascii="Calibri" w:hAnsi="Calibri"/>
+        </w:rPr>
+        <w:t>8. Embedding Strategy Trade-offs (Pros &amp; Cons)</w:t>
+      </w:r>
+    </w:p>
+    <w:tbl>
+      <w:tblPr>
+        <w:tblStyle w:val="TableGrid"/>
+        <w:tblW w:type="auto" w:w="0"/>
+        <w:tblLook w:firstColumn="1" w:firstRow="1" w:lastColumn="0" w:lastRow="0" w:noHBand="0" w:noVBand="1" w:val="04A0"/>
+      </w:tblPr>
+      <w:tblGrid>
+        <w:gridCol w:w="2160"/>
+        <w:gridCol w:w="2160"/>
+        <w:gridCol w:w="2160"/>
+        <w:gridCol w:w="2160"/>
+      </w:tblGrid>
+      <w:tr>
+        <w:tc>
+          <w:tcPr>
+            <w:tcW w:type="dxa" w:w="2160"/>
+          </w:tcPr>
+          <w:p>
+            <w:r>
+              <w:rPr>
+                <w:rFonts w:ascii="Calibri" w:hAnsi="Calibri"/>
+                <w:b/>
+                <w:sz w:val="20"/>
+              </w:rPr>
+              <w:t>Option</w:t>
+            </w:r>
+          </w:p>
+        </w:tc>
+        <w:tc>
+          <w:tcPr>
+            <w:tcW w:type="dxa" w:w="2160"/>
+          </w:tcPr>
+          <w:p>
+            <w:r>
+              <w:rPr>
+                <w:rFonts w:ascii="Calibri" w:hAnsi="Calibri"/>
+                <w:b/>
+                <w:sz w:val="20"/>
+              </w:rPr>
+              <w:t>Pros</w:t>
+            </w:r>
+          </w:p>
+        </w:tc>
+        <w:tc>
+          <w:tcPr>
+            <w:tcW w:type="dxa" w:w="2160"/>
+          </w:tcPr>
+          <w:p>
+            <w:r>
+              <w:rPr>
+                <w:rFonts w:ascii="Calibri" w:hAnsi="Calibri"/>
+                <w:b/>
+                <w:sz w:val="20"/>
+              </w:rPr>
+              <w:t>Cons</w:t>
+            </w:r>
+          </w:p>
+        </w:tc>
+        <w:tc>
+          <w:tcPr>
+            <w:tcW w:type="dxa" w:w="2160"/>
+          </w:tcPr>
+          <w:p>
+            <w:r>
+              <w:rPr>
+                <w:rFonts w:ascii="Calibri" w:hAnsi="Calibri"/>
+                <w:b/>
+                <w:sz w:val="20"/>
+              </w:rPr>
+              <w:t>Best Fit</w:t>
+            </w:r>
+          </w:p>
+        </w:tc>
+      </w:tr>
+      <w:tr>
+        <w:tc>
+          <w:tcPr>
+            <w:tcW w:type="dxa" w:w="2160"/>
+          </w:tcPr>
+          <w:p>
+            <w:r>
+              <w:rPr>
+                <w:rFonts w:ascii="Calibri" w:hAnsi="Calibri"/>
+                <w:b w:val="0"/>
+                <w:sz w:val="20"/>
+              </w:rPr>
+              <w:t>text-embedding-3-small (Current)</w:t>
+            </w:r>
+          </w:p>
+        </w:tc>
+        <w:tc>
+          <w:tcPr>
+            <w:tcW w:type="dxa" w:w="2160"/>
+          </w:tcPr>
+          <w:p>
+            <w:r>
+              <w:rPr>
+                <w:rFonts w:ascii="Calibri" w:hAnsi="Calibri"/>
+                <w:b w:val="0"/>
+                <w:sz w:val="20"/>
+              </w:rPr>
+              <w:t>Good semantic quality at low cost; fast enough for interactive use.</w:t>
+            </w:r>
+          </w:p>
+        </w:tc>
+        <w:tc>
+          <w:tcPr>
+            <w:tcW w:type="dxa" w:w="2160"/>
+          </w:tcPr>
+          <w:p>
+            <w:r>
+              <w:rPr>
+                <w:rFonts w:ascii="Calibri" w:hAnsi="Calibri"/>
+                <w:b w:val="0"/>
+                <w:sz w:val="20"/>
+              </w:rPr>
+              <w:t>May miss subtle domain-specific nuance vs larger models.</w:t>
+            </w:r>
+          </w:p>
+        </w:tc>
+        <w:tc>
+          <w:tcPr>
+            <w:tcW w:type="dxa" w:w="2160"/>
+          </w:tcPr>
+          <w:p>
+            <w:r>
+              <w:rPr>
+                <w:rFonts w:ascii="Calibri" w:hAnsi="Calibri"/>
+                <w:b w:val="0"/>
+                <w:sz w:val="20"/>
+              </w:rPr>
+              <w:t>General semantic keyword matching at scale</w:t>
+            </w:r>
+          </w:p>
+        </w:tc>
+      </w:tr>
+      <w:tr>
+        <w:tc>
+          <w:tcPr>
+            <w:tcW w:type="dxa" w:w="2160"/>
+          </w:tcPr>
+          <w:p>
+            <w:r>
+              <w:rPr>
+                <w:rFonts w:ascii="Calibri" w:hAnsi="Calibri"/>
+                <w:b w:val="0"/>
+                <w:sz w:val="20"/>
+              </w:rPr>
+              <w:t>Larger Embedding Models</w:t>
+            </w:r>
+          </w:p>
+        </w:tc>
+        <w:tc>
+          <w:tcPr>
+            <w:tcW w:type="dxa" w:w="2160"/>
+          </w:tcPr>
+          <w:p>
+            <w:r>
+              <w:rPr>
+                <w:rFonts w:ascii="Calibri" w:hAnsi="Calibri"/>
+                <w:b w:val="0"/>
+                <w:sz w:val="20"/>
+              </w:rPr>
+              <w:t>Potentially better semantic precision for complex terminology.</w:t>
+            </w:r>
+          </w:p>
+        </w:tc>
+        <w:tc>
+          <w:tcPr>
+            <w:tcW w:type="dxa" w:w="2160"/>
+          </w:tcPr>
+          <w:p>
+            <w:r>
+              <w:rPr>
+                <w:rFonts w:ascii="Calibri" w:hAnsi="Calibri"/>
+                <w:b w:val="0"/>
+                <w:sz w:val="20"/>
+              </w:rPr>
+              <w:t>Higher cost and latency; larger vector/storage footprint.</w:t>
+            </w:r>
+          </w:p>
+        </w:tc>
+        <w:tc>
+          <w:tcPr>
+            <w:tcW w:type="dxa" w:w="2160"/>
+          </w:tcPr>
+          <w:p>
+            <w:r>
+              <w:rPr>
+                <w:rFonts w:ascii="Calibri" w:hAnsi="Calibri"/>
+                <w:b w:val="0"/>
+                <w:sz w:val="20"/>
+              </w:rPr>
+              <w:t>High-stakes matching where precision is critical</w:t>
+            </w:r>
+          </w:p>
+        </w:tc>
+      </w:tr>
+      <w:tr>
+        <w:tc>
+          <w:tcPr>
+            <w:tcW w:type="dxa" w:w="2160"/>
+          </w:tcPr>
+          <w:p>
+            <w:r>
+              <w:rPr>
+                <w:rFonts w:ascii="Calibri" w:hAnsi="Calibri"/>
+                <w:b w:val="0"/>
+                <w:sz w:val="20"/>
+              </w:rPr>
+              <w:t>No Embeddings (Exact Overlap)</w:t>
+            </w:r>
+          </w:p>
+        </w:tc>
+        <w:tc>
+          <w:tcPr>
+            <w:tcW w:type="dxa" w:w="2160"/>
+          </w:tcPr>
+          <w:p>
+            <w:r>
+              <w:rPr>
+                <w:rFonts w:ascii="Calibri" w:hAnsi="Calibri"/>
+                <w:b w:val="0"/>
+                <w:sz w:val="20"/>
+              </w:rPr>
+              <w:t>Fully explainable logic; no embedding API dependency.</w:t>
+            </w:r>
+          </w:p>
+        </w:tc>
+        <w:tc>
+          <w:tcPr>
+            <w:tcW w:type="dxa" w:w="2160"/>
+          </w:tcPr>
+          <w:p>
+            <w:r>
+              <w:rPr>
+                <w:rFonts w:ascii="Calibri" w:hAnsi="Calibri"/>
+                <w:b w:val="0"/>
+                <w:sz w:val="20"/>
+              </w:rPr>
+              <w:t>Poor recall for related terms and synonyms.</w:t>
+            </w:r>
+          </w:p>
+        </w:tc>
+        <w:tc>
+          <w:tcPr>
+            <w:tcW w:type="dxa" w:w="2160"/>
+          </w:tcPr>
+          <w:p>
+            <w:r>
+              <w:rPr>
+                <w:rFonts w:ascii="Calibri" w:hAnsi="Calibri"/>
+                <w:b w:val="0"/>
+                <w:sz w:val="20"/>
+              </w:rPr>
+              <w:t>Strict deterministic keyword filtering</w:t>
+            </w:r>
+          </w:p>
+        </w:tc>
+      </w:tr>
+    </w:tbl>
+    <w:p/>
+    <w:p>
+      <w:pPr>
+        <w:pStyle w:val="Heading2"/>
+      </w:pPr>
+      <w:r>
+        <w:rPr>
+          <w:rFonts w:ascii="Calibri" w:hAnsi="Calibri"/>
+        </w:rPr>
+        <w:t>9. Regex vs Semantic Comparison Trade-offs (Pros &amp; Cons)</w:t>
+      </w:r>
+    </w:p>
+    <w:tbl>
+      <w:tblPr>
+        <w:tblStyle w:val="TableGrid"/>
+        <w:tblW w:type="auto" w:w="0"/>
+        <w:tblLook w:firstColumn="1" w:firstRow="1" w:lastColumn="0" w:lastRow="0" w:noHBand="0" w:noVBand="1" w:val="04A0"/>
+      </w:tblPr>
+      <w:tblGrid>
+        <w:gridCol w:w="2160"/>
+        <w:gridCol w:w="2160"/>
+        <w:gridCol w:w="2160"/>
+        <w:gridCol w:w="2160"/>
+      </w:tblGrid>
+      <w:tr>
+        <w:tc>
+          <w:tcPr>
+            <w:tcW w:type="dxa" w:w="2160"/>
+          </w:tcPr>
+          <w:p>
+            <w:r>
+              <w:rPr>
+                <w:rFonts w:ascii="Calibri" w:hAnsi="Calibri"/>
+                <w:b/>
+                <w:sz w:val="20"/>
+              </w:rPr>
+              <w:t>Option</w:t>
+            </w:r>
+          </w:p>
+        </w:tc>
+        <w:tc>
+          <w:tcPr>
+            <w:tcW w:type="dxa" w:w="2160"/>
+          </w:tcPr>
+          <w:p>
+            <w:r>
+              <w:rPr>
+                <w:rFonts w:ascii="Calibri" w:hAnsi="Calibri"/>
+                <w:b/>
+                <w:sz w:val="20"/>
+              </w:rPr>
+              <w:t>Pros</w:t>
+            </w:r>
+          </w:p>
+        </w:tc>
+        <w:tc>
+          <w:tcPr>
+            <w:tcW w:type="dxa" w:w="2160"/>
+          </w:tcPr>
+          <w:p>
+            <w:r>
+              <w:rPr>
+                <w:rFonts w:ascii="Calibri" w:hAnsi="Calibri"/>
+                <w:b/>
+                <w:sz w:val="20"/>
+              </w:rPr>
+              <w:t>Cons</w:t>
+            </w:r>
+          </w:p>
+        </w:tc>
+        <w:tc>
+          <w:tcPr>
+            <w:tcW w:type="dxa" w:w="2160"/>
+          </w:tcPr>
+          <w:p>
+            <w:r>
+              <w:rPr>
+                <w:rFonts w:ascii="Calibri" w:hAnsi="Calibri"/>
+                <w:b/>
+                <w:sz w:val="20"/>
+              </w:rPr>
+              <w:t>Best Fit</w:t>
+            </w:r>
+          </w:p>
+        </w:tc>
+      </w:tr>
+      <w:tr>
+        <w:tc>
+          <w:tcPr>
+            <w:tcW w:type="dxa" w:w="2160"/>
+          </w:tcPr>
+          <w:p>
+            <w:r>
+              <w:rPr>
+                <w:rFonts w:ascii="Calibri" w:hAnsi="Calibri"/>
+                <w:b w:val="0"/>
+                <w:sz w:val="20"/>
+              </w:rPr>
+              <w:t>Regex/Pattern Matching</w:t>
+            </w:r>
+          </w:p>
+        </w:tc>
+        <w:tc>
+          <w:tcPr>
+            <w:tcW w:type="dxa" w:w="2160"/>
+          </w:tcPr>
+          <w:p>
+            <w:r>
+              <w:rPr>
+                <w:rFonts w:ascii="Calibri" w:hAnsi="Calibri"/>
+                <w:b w:val="0"/>
+                <w:sz w:val="20"/>
+              </w:rPr>
+              <w:t>High interpretability; deterministic outputs; easy debugging.</w:t>
+            </w:r>
+          </w:p>
+        </w:tc>
+        <w:tc>
+          <w:tcPr>
+            <w:tcW w:type="dxa" w:w="2160"/>
+          </w:tcPr>
+          <w:p>
+            <w:r>
+              <w:rPr>
+                <w:rFonts w:ascii="Calibri" w:hAnsi="Calibri"/>
+                <w:b w:val="0"/>
+                <w:sz w:val="20"/>
+              </w:rPr>
+              <w:t>Lower recall for paraphrases and semantic variants.</w:t>
+            </w:r>
+          </w:p>
+        </w:tc>
+        <w:tc>
+          <w:tcPr>
+            <w:tcW w:type="dxa" w:w="2160"/>
+          </w:tcPr>
+          <w:p>
+            <w:r>
+              <w:rPr>
+                <w:rFonts w:ascii="Calibri" w:hAnsi="Calibri"/>
+                <w:b w:val="0"/>
+                <w:sz w:val="20"/>
+              </w:rPr>
+              <w:t>Rule-driven compliance and strict keyword checks</w:t>
+            </w:r>
+          </w:p>
+        </w:tc>
+      </w:tr>
+      <w:tr>
+        <w:tc>
+          <w:tcPr>
+            <w:tcW w:type="dxa" w:w="2160"/>
+          </w:tcPr>
+          <w:p>
+            <w:r>
+              <w:rPr>
+                <w:rFonts w:ascii="Calibri" w:hAnsi="Calibri"/>
+                <w:b w:val="0"/>
+                <w:sz w:val="20"/>
+              </w:rPr>
+              <w:t>Semantic Embedding Matching</w:t>
+            </w:r>
+          </w:p>
+        </w:tc>
+        <w:tc>
+          <w:tcPr>
+            <w:tcW w:type="dxa" w:w="2160"/>
+          </w:tcPr>
+          <w:p>
+            <w:r>
+              <w:rPr>
+                <w:rFonts w:ascii="Calibri" w:hAnsi="Calibri"/>
+                <w:b w:val="0"/>
+                <w:sz w:val="20"/>
+              </w:rPr>
+              <w:t>Higher recall across synonyms and related skills.</w:t>
+            </w:r>
+          </w:p>
+        </w:tc>
+        <w:tc>
+          <w:tcPr>
+            <w:tcW w:type="dxa" w:w="2160"/>
+          </w:tcPr>
+          <w:p>
+            <w:r>
+              <w:rPr>
+                <w:rFonts w:ascii="Calibri" w:hAnsi="Calibri"/>
+                <w:b w:val="0"/>
+                <w:sz w:val="20"/>
+              </w:rPr>
+              <w:t>Harder to explain to end users; threshold tuning required.</w:t>
+            </w:r>
+          </w:p>
+        </w:tc>
+        <w:tc>
+          <w:tcPr>
+            <w:tcW w:type="dxa" w:w="2160"/>
+          </w:tcPr>
+          <w:p>
+            <w:r>
+              <w:rPr>
+                <w:rFonts w:ascii="Calibri" w:hAnsi="Calibri"/>
+                <w:b w:val="0"/>
+                <w:sz w:val="20"/>
+              </w:rPr>
+              <w:t>Robust skill similarity and ATS relevance scoring</w:t>
+            </w:r>
+          </w:p>
+        </w:tc>
+      </w:tr>
+      <w:tr>
+        <w:tc>
+          <w:tcPr>
+            <w:tcW w:type="dxa" w:w="2160"/>
+          </w:tcPr>
+          <w:p>
+            <w:r>
+              <w:rPr>
+                <w:rFonts w:ascii="Calibri" w:hAnsi="Calibri"/>
+                <w:b w:val="0"/>
+                <w:sz w:val="20"/>
+              </w:rPr>
+              <w:t>Hybrid (Regex + Semantic)</w:t>
+            </w:r>
+          </w:p>
+        </w:tc>
+        <w:tc>
+          <w:tcPr>
+            <w:tcW w:type="dxa" w:w="2160"/>
+          </w:tcPr>
+          <w:p>
+            <w:r>
+              <w:rPr>
+                <w:rFonts w:ascii="Calibri" w:hAnsi="Calibri"/>
+                <w:b w:val="0"/>
+                <w:sz w:val="20"/>
+              </w:rPr>
+              <w:t>Balances precision and recall with layered safeguards.</w:t>
+            </w:r>
+          </w:p>
+        </w:tc>
+        <w:tc>
+          <w:tcPr>
+            <w:tcW w:type="dxa" w:w="2160"/>
+          </w:tcPr>
+          <w:p>
+            <w:r>
+              <w:rPr>
+                <w:rFonts w:ascii="Calibri" w:hAnsi="Calibri"/>
+                <w:b w:val="0"/>
+                <w:sz w:val="20"/>
+              </w:rPr>
+              <w:t>Increased maintenance complexity and orchestration effort.</w:t>
+            </w:r>
+          </w:p>
+        </w:tc>
+        <w:tc>
+          <w:tcPr>
+            <w:tcW w:type="dxa" w:w="2160"/>
+          </w:tcPr>
+          <w:p>
+            <w:r>
+              <w:rPr>
+                <w:rFonts w:ascii="Calibri" w:hAnsi="Calibri"/>
+                <w:b w:val="0"/>
+                <w:sz w:val="20"/>
+              </w:rPr>
+              <w:t>Production systems requiring trust + flexibility</w:t>
+            </w:r>
+          </w:p>
+        </w:tc>
+      </w:tr>
+    </w:tbl>
+    <w:p/>
+    <w:p>
+      <w:pPr>
+        <w:pStyle w:val="Heading2"/>
+      </w:pPr>
+      <w:r>
+        <w:rPr>
+          <w:rFonts w:ascii="Calibri" w:hAnsi="Calibri"/>
+        </w:rPr>
+        <w:t>10. Testing and Validation Summary</w:t>
+      </w:r>
+    </w:p>
+    <w:p>
+      <w:r>
+        <w:rPr>
+          <w:rFonts w:ascii="Calibri" w:hAnsi="Calibri"/>
+          <w:b/>
+        </w:rPr>
+        <w:t>Validation Checks:</w:t>
+      </w:r>
+    </w:p>
+    <w:p>
+      <w:pPr>
+        <w:pStyle w:val="ListBullet"/>
+      </w:pPr>
+      <w:r>
+        <w:rPr>
+          <w:rFonts w:ascii="Calibri" w:hAnsi="Calibri"/>
+          <w:sz w:val="20"/>
+        </w:rPr>
+        <w:t>End-to-end workflow verified from resume input to PDF/DOCX output.</w:t>
+      </w:r>
+    </w:p>
+    <w:p>
+      <w:pPr>
+        <w:pStyle w:val="ListBullet"/>
+      </w:pPr>
+      <w:r>
+        <w:rPr>
+          <w:rFonts w:ascii="Calibri" w:hAnsi="Calibri"/>
+          <w:sz w:val="20"/>
+        </w:rPr>
+        <w:t>Semantic matching behavior validated with related-skill scenarios.</w:t>
+      </w:r>
+    </w:p>
+    <w:p>
+      <w:pPr>
+        <w:pStyle w:val="ListBullet"/>
+      </w:pPr>
+      <w:r>
+        <w:rPr>
+          <w:rFonts w:ascii="Calibri" w:hAnsi="Calibri"/>
+          <w:sz w:val="20"/>
+        </w:rPr>
+        <w:t>ATS scoring feedback loop tested during iterative resume revision.</w:t>
+      </w:r>
+    </w:p>
+    <w:p>
+      <w:pPr>
+        <w:pStyle w:val="ListBullet"/>
+      </w:pPr>
+      <w:r>
+        <w:rPr>
+          <w:rFonts w:ascii="Calibri" w:hAnsi="Calibri"/>
+          <w:sz w:val="20"/>
+        </w:rPr>
+        <w:t>Cross-platform report generation validated for Linux execution.</w:t>
+      </w:r>
+    </w:p>
+    <w:p>
+      <w:pPr>
+        <w:pStyle w:val="ListBullet"/>
+      </w:pPr>
+      <w:r>
+        <w:rPr>
+          <w:rFonts w:ascii="Calibri" w:hAnsi="Calibri"/>
+          <w:sz w:val="20"/>
+        </w:rPr>
+        <w:t>Module-level functionality verified for extractor, parser, matcher, generator, and reviser.</w:t>
+      </w:r>
+    </w:p>
+    <w:p>
+      <w:pPr>
+        <w:pStyle w:val="ListBullet"/>
+      </w:pPr>
+      <w:r>
+        <w:rPr>
+          <w:rFonts w:ascii="Calibri" w:hAnsi="Calibri"/>
+          <w:sz w:val="20"/>
+        </w:rPr>
+        <w:t>Error handling pathways tested for missing inputs and parsing edge cases.</w:t>
+      </w:r>
+    </w:p>
+    <w:p>
+      <w:r>
+        <w:rPr>
+          <w:rFonts w:ascii="Calibri" w:hAnsi="Calibri"/>
+          <w:b/>
+        </w:rPr>
+        <w:t>Quality Indicators:</w:t>
+      </w:r>
+    </w:p>
+    <w:p>
+      <w:pPr>
+        <w:pStyle w:val="ListBullet"/>
+      </w:pPr>
+      <w:r>
+        <w:rPr>
+          <w:rFonts w:ascii="Calibri" w:hAnsi="Calibri"/>
+          <w:sz w:val="20"/>
+        </w:rPr>
+        <w:t>Resume extraction quality: robust on structured and semi-structured resumes.</w:t>
+      </w:r>
+    </w:p>
+    <w:p>
+      <w:pPr>
+        <w:pStyle w:val="ListBullet"/>
+      </w:pPr>
+      <w:r>
+        <w:rPr>
+          <w:rFonts w:ascii="Calibri" w:hAnsi="Calibri"/>
+          <w:sz w:val="20"/>
+        </w:rPr>
+        <w:t>Generation turnaround: interactive workflow maintained for practical usage.</w:t>
+      </w:r>
+    </w:p>
+    <w:p>
+      <w:pPr>
+        <w:pStyle w:val="ListBullet"/>
+      </w:pPr>
+      <w:r>
+        <w:rPr>
+          <w:rFonts w:ascii="Calibri" w:hAnsi="Calibri"/>
+          <w:sz w:val="20"/>
+        </w:rPr>
+        <w:t>Semantic relevance: improved matching quality over exact keyword overlap baselines.</w:t>
+      </w:r>
+    </w:p>
+    <w:p>
+      <w:pPr>
+        <w:pStyle w:val="ListBullet"/>
+      </w:pPr>
+      <w:r>
+        <w:rPr>
+          <w:rFonts w:ascii="Calibri" w:hAnsi="Calibri"/>
+          <w:sz w:val="20"/>
+        </w:rPr>
+        <w:t>Maintainability: modular design supports isolated updates by component.</w:t>
+      </w:r>
+    </w:p>
+    <w:p>
+      <w:r>
+        <w:br w:type="page"/>
+      </w:r>
+    </w:p>
+    <w:p>
+      <w:pPr>
+        <w:pStyle w:val="Heading2"/>
+      </w:pPr>
+      <w:r>
+        <w:rPr>
+          <w:rFonts w:ascii="Calibri" w:hAnsi="Calibri"/>
+        </w:rPr>
+        <w:t>11. Results and Analysis</w:t>
       </w:r>
     </w:p>
     <w:p>
@@ -416,8 +2045,9 @@
       <w:r>
         <w:rPr>
           <w:rFonts w:ascii="Calibri" w:hAnsi="Calibri"/>
+          <w:sz w:val="20"/>
         </w:rPr>
-        <w:t>8 fully functional modules (~2,530 lines of code)</w:t>
+        <w:t>8 fully functional core modules with modular execution</w:t>
       </w:r>
     </w:p>
     <w:p>
@@ -427,8 +2057,9 @@
       <w:r>
         <w:rPr>
           <w:rFonts w:ascii="Calibri" w:hAnsi="Calibri"/>
+          <w:sz w:val="20"/>
         </w:rPr>
-        <w:t>4 core features + 4 supporting features</w:t>
+        <w:t>4 core features with supporting ATS and matching utilities</w:t>
       </w:r>
     </w:p>
     <w:p>
@@ -438,6 +2069,7 @@
       <w:r>
         <w:rPr>
           <w:rFonts w:ascii="Calibri" w:hAnsi="Calibri"/>
+          <w:sz w:val="20"/>
         </w:rPr>
         <w:t>Production-ready deployment</w:t>
       </w:r>
@@ -449,8 +2081,9 @@
       <w:r>
         <w:rPr>
           <w:rFonts w:ascii="Calibri" w:hAnsi="Calibri"/>
+          <w:sz w:val="20"/>
         </w:rPr>
-        <w:t>60% cost savings vs. single-model approach</w:t>
+        <w:t>Semantic similarity matching integrated in matcher.py and ats_checker.py</w:t>
       </w:r>
     </w:p>
     <w:p>
@@ -460,8 +2093,9 @@
       <w:r>
         <w:rPr>
           <w:rFonts w:ascii="Calibri" w:hAnsi="Calibri"/>
+          <w:sz w:val="20"/>
         </w:rPr>
-        <w:t>Resume extraction accuracy: 95%+</w:t>
+        <w:t>Improved related-skill detection beyond exact keyword overlap</w:t>
       </w:r>
     </w:p>
     <w:p>
@@ -471,13 +2105,9 @@
       <w:r>
         <w:rPr>
           <w:rFonts w:ascii="Calibri" w:hAnsi="Calibri"/>
+          <w:sz w:val="20"/>
         </w:rPr>
-        <w:t>Generation time: &lt;2 minutes per resume</w:t>
-      </w:r>
-    </w:p>
-    <w:p>
-      <w:r>
-        <w:br w:type="page"/>
+        <w:t>Cross-platform report and resume export support</w:t>
       </w:r>
     </w:p>
     <w:p>
@@ -488,7 +2118,7 @@
         <w:rPr>
           <w:rFonts w:ascii="Calibri" w:hAnsi="Calibri"/>
         </w:rPr>
-        <w:t>6. Conclusion</w:t>
+        <w:t>12. Conclusion</w:t>
       </w:r>
     </w:p>
     <w:p>
@@ -507,6 +2137,7 @@
       <w:r>
         <w:rPr>
           <w:rFonts w:ascii="Calibri" w:hAnsi="Calibri"/>
+          <w:sz w:val="20"/>
         </w:rPr>
         <w:t>Fully automated resume optimization pipeline</w:t>
       </w:r>
@@ -518,8 +2149,9 @@
       <w:r>
         <w:rPr>
           <w:rFonts w:ascii="Calibri" w:hAnsi="Calibri"/>
+          <w:sz w:val="20"/>
         </w:rPr>
-        <w:t>Intelligent job-profile alignment system</w:t>
+        <w:t>Intelligent job-profile alignment with semantic matching</w:t>
       </w:r>
     </w:p>
     <w:p>
@@ -529,6 +2161,7 @@
       <w:r>
         <w:rPr>
           <w:rFonts w:ascii="Calibri" w:hAnsi="Calibri"/>
+          <w:sz w:val="20"/>
         </w:rPr>
         <w:t>ATS-optimized resume generation (80%+ compatibility)</w:t>
       </w:r>
@@ -540,6 +2173,7 @@
       <w:r>
         <w:rPr>
           <w:rFonts w:ascii="Calibri" w:hAnsi="Calibri"/>
+          <w:sz w:val="20"/>
         </w:rPr>
         <w:t>Real-time feedback and revision capability</w:t>
       </w:r>
@@ -551,6 +2185,7 @@
       <w:r>
         <w:rPr>
           <w:rFonts w:ascii="Calibri" w:hAnsi="Calibri"/>
+          <w:sz w:val="20"/>
         </w:rPr>
         <w:t>Cost-efficient dual-LLM orchestration</w:t>
       </w:r>
@@ -562,6 +2197,7 @@
       <w:r>
         <w:rPr>
           <w:rFonts w:ascii="Calibri" w:hAnsi="Calibri"/>
+          <w:sz w:val="20"/>
         </w:rPr>
         <w:t>Modular, maintainable architecture</w:t>
       </w:r>
@@ -583,6 +2219,7 @@
       <w:r>
         <w:rPr>
           <w:rFonts w:ascii="Calibri" w:hAnsi="Calibri"/>
+          <w:sz w:val="20"/>
         </w:rPr>
         <w:t>Multi-language support (6 languages)</w:t>
       </w:r>
@@ -594,6 +2231,7 @@
       <w:r>
         <w:rPr>
           <w:rFonts w:ascii="Calibri" w:hAnsi="Calibri"/>
+          <w:sz w:val="20"/>
         </w:rPr>
         <w:t>Cloud deployment (REST API, web app)</w:t>
       </w:r>
@@ -605,6 +2243,7 @@
       <w:r>
         <w:rPr>
           <w:rFonts w:ascii="Calibri" w:hAnsi="Calibri"/>
+          <w:sz w:val="20"/>
         </w:rPr>
         <w:t>Advanced analytics dashboard</w:t>
       </w:r>
@@ -616,6 +2255,7 @@
       <w:r>
         <w:rPr>
           <w:rFonts w:ascii="Calibri" w:hAnsi="Calibri"/>
+          <w:sz w:val="20"/>
         </w:rPr>
         <w:t>Industry-specific templates</w:t>
       </w:r>
@@ -627,6 +2267,7 @@
       <w:r>
         <w:rPr>
           <w:rFonts w:ascii="Calibri" w:hAnsi="Calibri"/>
+          <w:sz w:val="20"/>
         </w:rPr>
         <w:t>Integration with LinkedIn, job boards, ATS platforms</w:t>
       </w:r>

</xml_diff>

<commit_message>
updated with right chunking strategy
</commit_message>
<xml_diff>
--- a/Summary/CVCreationUsingLLM_Project_Report.docx
+++ b/Summary/CVCreationUsingLLM_Project_Report.docx
@@ -36,7 +36,7 @@
           <w:rFonts w:ascii="Calibri" w:hAnsi="Calibri"/>
           <w:sz w:val="20"/>
         </w:rPr>
-        <w:t>This capstone project presents a dual-LLM system for generating tailored, ATS-optimized CVs using OpenAI's GPT-4o-mini and GPT-4o models with LangChain orchestration. The system automates resume extraction from unstructured documents, parses job requirements, strategically aligns candidate profiles, and generates optimized resumes with real-time ATS feedback. The latest implementation adds semantic similarity scoring using OpenAI embeddings (text-embedding-3-small) for both profile-job matching and ATS keyword analysis, improving detection of related skills beyond exact keyword overlap. This report also captures architecture decisions and engineering trade-offs across model selection, chunking strategy, embedding choice, and regex-vs-semantic matching design.</w:t>
+        <w:t>This capstone project presents a dual-LLM system for generating tailored, ATS-optimized CVs using OpenAI's GPT-4o-mini and GPT-4o models with LangChain orchestration. The system automates resume extraction from unstructured documents, parses job requirements, strategically aligns candidate profiles, and generates optimized resumes with real-time ATS feedback. The implementation includes semantic similarity scoring using OpenAI embeddings (text-embedding-3-small), frequency-weighted (TF) keyword selection via Python Counter, curated n-gram phrase detection for 17 multi-word technical terms, and threshold-based section-aware document chunking with structured merge logic — ensuring robustness at scale. This report captures architecture decisions and engineering trade-offs across model selection, chunking strategy, embedding choice, and regex-vs-semantic matching design.</w:t>
       </w:r>
     </w:p>
     <w:p>
@@ -1053,7 +1053,7 @@
         <w:rPr>
           <w:rFonts w:ascii="Calibri" w:hAnsi="Calibri"/>
         </w:rPr>
-        <w:t>7. Chunking Strategy Trade-offs (Pros &amp; Cons)</w:t>
+        <w:t>7. Chunking Strategy Trade-offs &amp; Implementation</w:t>
       </w:r>
     </w:p>
     <w:tbl>
@@ -1142,7 +1142,7 @@
                 <w:b w:val="0"/>
                 <w:sz w:val="20"/>
               </w:rPr>
-              <w:t>No Chunking</w:t>
+              <w:t>No Chunking (Previous)</w:t>
             </w:r>
           </w:p>
         </w:tc>
@@ -1172,7 +1172,7 @@
                 <w:b w:val="0"/>
                 <w:sz w:val="20"/>
               </w:rPr>
-              <w:t>Fails on long inputs due to token limits and higher request costs.</w:t>
+              <w:t>Fails on long inputs due to token limits; no merge logic needed but no protection either.</w:t>
             </w:r>
           </w:p>
         </w:tc>
@@ -1187,7 +1187,7 @@
                 <w:b w:val="0"/>
                 <w:sz w:val="20"/>
               </w:rPr>
-              <w:t>Short resumes or compact job descriptions</w:t>
+              <w:t>Short resumes or compact job descriptions only</w:t>
             </w:r>
           </w:p>
         </w:tc>
@@ -1234,7 +1234,7 @@
                 <w:b w:val="0"/>
                 <w:sz w:val="20"/>
               </w:rPr>
-              <w:t>Can split related context across chunk boundaries.</w:t>
+              <w:t>Can split related context across chunk boundaries, reducing extraction quality.</w:t>
             </w:r>
           </w:p>
         </w:tc>
@@ -1249,7 +1249,7 @@
                 <w:b w:val="0"/>
                 <w:sz w:val="20"/>
               </w:rPr>
-              <w:t>Baseline scalable processing</w:t>
+              <w:t>Baseline scalable processing where section fidelity is low priority</w:t>
             </w:r>
           </w:p>
         </w:tc>
@@ -1266,7 +1266,7 @@
                 <w:b w:val="0"/>
                 <w:sz w:val="20"/>
               </w:rPr>
-              <w:t>Semantic/Section-Aware Chunking</w:t>
+              <w:t>Section-Aware + Bounded (Current)</w:t>
             </w:r>
           </w:p>
         </w:tc>
@@ -1281,7 +1281,7 @@
                 <w:b w:val="0"/>
                 <w:sz w:val="20"/>
               </w:rPr>
-              <w:t>Better context preservation; stronger extraction accuracy for long docs.</w:t>
+              <w:t>Preserves section context; falls back to size chunking; char-threshold is env-tunable; per-chunk LLM calls with structured merge.</w:t>
             </w:r>
           </w:p>
         </w:tc>
@@ -1296,7 +1296,7 @@
                 <w:b w:val="0"/>
                 <w:sz w:val="20"/>
               </w:rPr>
-              <w:t>Higher implementation complexity and tuning effort.</w:t>
+              <w:t>More implementation complexity; merge logic must handle deduplication consistently.</w:t>
             </w:r>
           </w:p>
         </w:tc>
@@ -1311,7 +1311,7 @@
                 <w:b w:val="0"/>
                 <w:sz w:val="20"/>
               </w:rPr>
-              <w:t>Quality-sensitive extraction pipelines</w:t>
+              <w:t>Production extraction pipelines — implemented in extractor.py and parser.py</w:t>
             </w:r>
           </w:p>
         </w:tc>
@@ -1872,6 +1872,494 @@
         <w:rPr>
           <w:rFonts w:ascii="Calibri" w:hAnsi="Calibri"/>
         </w:rPr>
+        <w:t>7b. Chunking Implementation Details</w:t>
+      </w:r>
+    </w:p>
+    <w:p>
+      <w:r>
+        <w:rPr>
+          <w:rFonts w:ascii="Calibri" w:hAnsi="Calibri"/>
+          <w:b/>
+        </w:rPr>
+        <w:t>Threshold Configuration:</w:t>
+      </w:r>
+    </w:p>
+    <w:tbl>
+      <w:tblPr>
+        <w:tblStyle w:val="TableGrid"/>
+        <w:tblW w:type="auto" w:w="0"/>
+        <w:tblLook w:firstColumn="1" w:firstRow="1" w:lastColumn="0" w:lastRow="0" w:noHBand="0" w:noVBand="1" w:val="04A0"/>
+      </w:tblPr>
+      <w:tblGrid>
+        <w:gridCol w:w="2160"/>
+        <w:gridCol w:w="2160"/>
+        <w:gridCol w:w="2160"/>
+        <w:gridCol w:w="2160"/>
+      </w:tblGrid>
+      <w:tr>
+        <w:tc>
+          <w:tcPr>
+            <w:tcW w:type="dxa" w:w="2160"/>
+          </w:tcPr>
+          <w:p>
+            <w:r>
+              <w:rPr>
+                <w:rFonts w:ascii="Calibri" w:hAnsi="Calibri"/>
+                <w:b/>
+                <w:sz w:val="20"/>
+              </w:rPr>
+              <w:t>Module</w:t>
+            </w:r>
+          </w:p>
+        </w:tc>
+        <w:tc>
+          <w:tcPr>
+            <w:tcW w:type="dxa" w:w="2160"/>
+          </w:tcPr>
+          <w:p>
+            <w:r>
+              <w:rPr>
+                <w:rFonts w:ascii="Calibri" w:hAnsi="Calibri"/>
+                <w:b/>
+                <w:sz w:val="20"/>
+              </w:rPr>
+              <w:t>Doc Threshold</w:t>
+            </w:r>
+          </w:p>
+        </w:tc>
+        <w:tc>
+          <w:tcPr>
+            <w:tcW w:type="dxa" w:w="2160"/>
+          </w:tcPr>
+          <w:p>
+            <w:r>
+              <w:rPr>
+                <w:rFonts w:ascii="Calibri" w:hAnsi="Calibri"/>
+                <w:b/>
+                <w:sz w:val="20"/>
+              </w:rPr>
+              <w:t>Chunk Size</w:t>
+            </w:r>
+          </w:p>
+        </w:tc>
+        <w:tc>
+          <w:tcPr>
+            <w:tcW w:type="dxa" w:w="2160"/>
+          </w:tcPr>
+          <w:p>
+            <w:r>
+              <w:rPr>
+                <w:rFonts w:ascii="Calibri" w:hAnsi="Calibri"/>
+                <w:b/>
+                <w:sz w:val="20"/>
+              </w:rPr>
+              <w:t>Overlap</w:t>
+            </w:r>
+          </w:p>
+        </w:tc>
+      </w:tr>
+      <w:tr>
+        <w:tc>
+          <w:tcPr>
+            <w:tcW w:type="dxa" w:w="2160"/>
+          </w:tcPr>
+          <w:p>
+            <w:r>
+              <w:rPr>
+                <w:rFonts w:ascii="Calibri" w:hAnsi="Calibri"/>
+                <w:b w:val="0"/>
+                <w:sz w:val="20"/>
+              </w:rPr>
+              <w:t>extractor.py</w:t>
+            </w:r>
+          </w:p>
+        </w:tc>
+        <w:tc>
+          <w:tcPr>
+            <w:tcW w:type="dxa" w:w="2160"/>
+          </w:tcPr>
+          <w:p>
+            <w:r>
+              <w:rPr>
+                <w:rFonts w:ascii="Calibri" w:hAnsi="Calibri"/>
+                <w:b w:val="0"/>
+                <w:sz w:val="20"/>
+              </w:rPr>
+              <w:t>6,000 chars</w:t>
+            </w:r>
+          </w:p>
+        </w:tc>
+        <w:tc>
+          <w:tcPr>
+            <w:tcW w:type="dxa" w:w="2160"/>
+          </w:tcPr>
+          <w:p>
+            <w:r>
+              <w:rPr>
+                <w:rFonts w:ascii="Calibri" w:hAnsi="Calibri"/>
+                <w:b w:val="0"/>
+                <w:sz w:val="20"/>
+              </w:rPr>
+              <w:t>3,500 chars</w:t>
+            </w:r>
+          </w:p>
+        </w:tc>
+        <w:tc>
+          <w:tcPr>
+            <w:tcW w:type="dxa" w:w="2160"/>
+          </w:tcPr>
+          <w:p>
+            <w:r>
+              <w:rPr>
+                <w:rFonts w:ascii="Calibri" w:hAnsi="Calibri"/>
+                <w:b w:val="0"/>
+                <w:sz w:val="20"/>
+              </w:rPr>
+              <w:t>300 chars</w:t>
+            </w:r>
+          </w:p>
+        </w:tc>
+      </w:tr>
+      <w:tr>
+        <w:tc>
+          <w:tcPr>
+            <w:tcW w:type="dxa" w:w="2160"/>
+          </w:tcPr>
+          <w:p>
+            <w:r>
+              <w:rPr>
+                <w:rFonts w:ascii="Calibri" w:hAnsi="Calibri"/>
+                <w:b w:val="0"/>
+                <w:sz w:val="20"/>
+              </w:rPr>
+              <w:t>parser.py</w:t>
+            </w:r>
+          </w:p>
+        </w:tc>
+        <w:tc>
+          <w:tcPr>
+            <w:tcW w:type="dxa" w:w="2160"/>
+          </w:tcPr>
+          <w:p>
+            <w:r>
+              <w:rPr>
+                <w:rFonts w:ascii="Calibri" w:hAnsi="Calibri"/>
+                <w:b w:val="0"/>
+                <w:sz w:val="20"/>
+              </w:rPr>
+              <w:t>5,000 chars</w:t>
+            </w:r>
+          </w:p>
+        </w:tc>
+        <w:tc>
+          <w:tcPr>
+            <w:tcW w:type="dxa" w:w="2160"/>
+          </w:tcPr>
+          <w:p>
+            <w:r>
+              <w:rPr>
+                <w:rFonts w:ascii="Calibri" w:hAnsi="Calibri"/>
+                <w:b w:val="0"/>
+                <w:sz w:val="20"/>
+              </w:rPr>
+              <w:t>3,000 chars</w:t>
+            </w:r>
+          </w:p>
+        </w:tc>
+        <w:tc>
+          <w:tcPr>
+            <w:tcW w:type="dxa" w:w="2160"/>
+          </w:tcPr>
+          <w:p>
+            <w:r>
+              <w:rPr>
+                <w:rFonts w:ascii="Calibri" w:hAnsi="Calibri"/>
+                <w:b w:val="0"/>
+                <w:sz w:val="20"/>
+              </w:rPr>
+              <w:t>250 chars</w:t>
+            </w:r>
+          </w:p>
+        </w:tc>
+      </w:tr>
+    </w:tbl>
+    <w:p/>
+    <w:p>
+      <w:r>
+        <w:rPr>
+          <w:rFonts w:ascii="Calibri" w:hAnsi="Calibri"/>
+          <w:b/>
+        </w:rPr>
+        <w:t>Chunking Stages:</w:t>
+      </w:r>
+    </w:p>
+    <w:p>
+      <w:pPr>
+        <w:pStyle w:val="ListBullet"/>
+      </w:pPr>
+      <w:r>
+        <w:rPr>
+          <w:rFonts w:ascii="Calibri" w:hAnsi="Calibri"/>
+          <w:sz w:val="20"/>
+        </w:rPr>
+        <w:t>Stage 0: If len(text) &lt;= threshold, send whole document — no overhead.</w:t>
+      </w:r>
+    </w:p>
+    <w:p>
+      <w:pPr>
+        <w:pStyle w:val="ListBullet"/>
+      </w:pPr>
+      <w:r>
+        <w:rPr>
+          <w:rFonts w:ascii="Calibri" w:hAnsi="Calibri"/>
+          <w:sz w:val="20"/>
+        </w:rPr>
+        <w:t>Stage 1: Split by known section headers (e.g. EXPERIENCE, SKILLS, REQUIREMENTS).</w:t>
+      </w:r>
+    </w:p>
+    <w:p>
+      <w:pPr>
+        <w:pStyle w:val="ListBullet"/>
+      </w:pPr>
+      <w:r>
+        <w:rPr>
+          <w:rFonts w:ascii="Calibri" w:hAnsi="Calibri"/>
+          <w:sz w:val="20"/>
+        </w:rPr>
+        <w:t>Stage 2: If any section exceeds chunk_size, apply paragraph-aware size splitting with overlap.</w:t>
+      </w:r>
+    </w:p>
+    <w:p>
+      <w:pPr>
+        <w:pStyle w:val="ListBullet"/>
+      </w:pPr>
+      <w:r>
+        <w:rPr>
+          <w:rFonts w:ascii="Calibri" w:hAnsi="Calibri"/>
+          <w:sz w:val="20"/>
+        </w:rPr>
+        <w:t>Merge: Scalar fields keep first non-null value; list fields use order-preserving JSON-key deduplication; nested skill/keyword dicts merged per sub-category.</w:t>
+      </w:r>
+    </w:p>
+    <w:p>
+      <w:pPr>
+        <w:pStyle w:val="Heading2"/>
+      </w:pPr>
+      <w:r>
+        <w:rPr>
+          <w:rFonts w:ascii="Calibri" w:hAnsi="Calibri"/>
+        </w:rPr>
+        <w:t>7c. Keyword Optimisation — Priorities 1 &amp; 2</w:t>
+      </w:r>
+    </w:p>
+    <w:tbl>
+      <w:tblPr>
+        <w:tblStyle w:val="TableGrid"/>
+        <w:tblW w:type="auto" w:w="0"/>
+        <w:tblLook w:firstColumn="1" w:firstRow="1" w:lastColumn="0" w:lastRow="0" w:noHBand="0" w:noVBand="1" w:val="04A0"/>
+      </w:tblPr>
+      <w:tblGrid>
+        <w:gridCol w:w="2160"/>
+        <w:gridCol w:w="2160"/>
+        <w:gridCol w:w="2160"/>
+        <w:gridCol w:w="2160"/>
+      </w:tblGrid>
+      <w:tr>
+        <w:tc>
+          <w:tcPr>
+            <w:tcW w:type="dxa" w:w="2160"/>
+          </w:tcPr>
+          <w:p>
+            <w:r>
+              <w:rPr>
+                <w:rFonts w:ascii="Calibri" w:hAnsi="Calibri"/>
+                <w:b/>
+                <w:sz w:val="20"/>
+              </w:rPr>
+              <w:t>Option</w:t>
+            </w:r>
+          </w:p>
+        </w:tc>
+        <w:tc>
+          <w:tcPr>
+            <w:tcW w:type="dxa" w:w="2160"/>
+          </w:tcPr>
+          <w:p>
+            <w:r>
+              <w:rPr>
+                <w:rFonts w:ascii="Calibri" w:hAnsi="Calibri"/>
+                <w:b/>
+                <w:sz w:val="20"/>
+              </w:rPr>
+              <w:t>Pros</w:t>
+            </w:r>
+          </w:p>
+        </w:tc>
+        <w:tc>
+          <w:tcPr>
+            <w:tcW w:type="dxa" w:w="2160"/>
+          </w:tcPr>
+          <w:p>
+            <w:r>
+              <w:rPr>
+                <w:rFonts w:ascii="Calibri" w:hAnsi="Calibri"/>
+                <w:b/>
+                <w:sz w:val="20"/>
+              </w:rPr>
+              <w:t>Cons</w:t>
+            </w:r>
+          </w:p>
+        </w:tc>
+        <w:tc>
+          <w:tcPr>
+            <w:tcW w:type="dxa" w:w="2160"/>
+          </w:tcPr>
+          <w:p>
+            <w:r>
+              <w:rPr>
+                <w:rFonts w:ascii="Calibri" w:hAnsi="Calibri"/>
+                <w:b/>
+                <w:sz w:val="20"/>
+              </w:rPr>
+              <w:t>Best Fit</w:t>
+            </w:r>
+          </w:p>
+        </w:tc>
+      </w:tr>
+      <w:tr>
+        <w:tc>
+          <w:tcPr>
+            <w:tcW w:type="dxa" w:w="2160"/>
+          </w:tcPr>
+          <w:p>
+            <w:r>
+              <w:rPr>
+                <w:rFonts w:ascii="Calibri" w:hAnsi="Calibri"/>
+                <w:b w:val="0"/>
+                <w:sz w:val="20"/>
+              </w:rPr>
+              <w:t>Priority 1: TF Weighting</w:t>
+            </w:r>
+          </w:p>
+        </w:tc>
+        <w:tc>
+          <w:tcPr>
+            <w:tcW w:type="dxa" w:w="2160"/>
+          </w:tcPr>
+          <w:p>
+            <w:r>
+              <w:rPr>
+                <w:rFonts w:ascii="Calibri" w:hAnsi="Calibri"/>
+                <w:b w:val="0"/>
+                <w:sz w:val="20"/>
+              </w:rPr>
+              <w:t>Most frequent / important keywords surface first; skills and technologies double-weighted.</w:t>
+            </w:r>
+          </w:p>
+        </w:tc>
+        <w:tc>
+          <w:tcPr>
+            <w:tcW w:type="dxa" w:w="2160"/>
+          </w:tcPr>
+          <w:p>
+            <w:r>
+              <w:rPr>
+                <w:rFonts w:ascii="Calibri" w:hAnsi="Calibri"/>
+                <w:b w:val="0"/>
+                <w:sz w:val="20"/>
+              </w:rPr>
+              <w:t>Frequency alone does not capture domain rarity (TF-IDF not yet applied).</w:t>
+            </w:r>
+          </w:p>
+        </w:tc>
+        <w:tc>
+          <w:tcPr>
+            <w:tcW w:type="dxa" w:w="2160"/>
+          </w:tcPr>
+          <w:p>
+            <w:r>
+              <w:rPr>
+                <w:rFonts w:ascii="Calibri" w:hAnsi="Calibri"/>
+                <w:b w:val="0"/>
+                <w:sz w:val="20"/>
+              </w:rPr>
+              <w:t>Top-30 keyword selection in matcher.py and ats_checker.py</w:t>
+            </w:r>
+          </w:p>
+        </w:tc>
+      </w:tr>
+      <w:tr>
+        <w:tc>
+          <w:tcPr>
+            <w:tcW w:type="dxa" w:w="2160"/>
+          </w:tcPr>
+          <w:p>
+            <w:r>
+              <w:rPr>
+                <w:rFonts w:ascii="Calibri" w:hAnsi="Calibri"/>
+                <w:b w:val="0"/>
+                <w:sz w:val="20"/>
+              </w:rPr>
+              <w:t>Priority 2: N-Gram Phrases</w:t>
+            </w:r>
+          </w:p>
+        </w:tc>
+        <w:tc>
+          <w:tcPr>
+            <w:tcW w:type="dxa" w:w="2160"/>
+          </w:tcPr>
+          <w:p>
+            <w:r>
+              <w:rPr>
+                <w:rFonts w:ascii="Calibri" w:hAnsi="Calibri"/>
+                <w:b w:val="0"/>
+                <w:sz w:val="20"/>
+              </w:rPr>
+              <w:t>17 curated technical phrases (e.g. machine learning, ci/cd); frequency-preserving via repeated list entries; no arbitrary bigram noise.</w:t>
+            </w:r>
+          </w:p>
+        </w:tc>
+        <w:tc>
+          <w:tcPr>
+            <w:tcW w:type="dxa" w:w="2160"/>
+          </w:tcPr>
+          <w:p>
+            <w:r>
+              <w:rPr>
+                <w:rFonts w:ascii="Calibri" w:hAnsi="Calibri"/>
+                <w:b w:val="0"/>
+                <w:sz w:val="20"/>
+              </w:rPr>
+              <w:t>Phrase list is manually maintained; new terminology requires explicit addition.</w:t>
+            </w:r>
+          </w:p>
+        </w:tc>
+        <w:tc>
+          <w:tcPr>
+            <w:tcW w:type="dxa" w:w="2160"/>
+          </w:tcPr>
+          <w:p>
+            <w:r>
+              <w:rPr>
+                <w:rFonts w:ascii="Calibri" w:hAnsi="Calibri"/>
+                <w:b w:val="0"/>
+                <w:sz w:val="20"/>
+              </w:rPr>
+              <w:t>High-precision multi-word skill detection in both modules</w:t>
+            </w:r>
+          </w:p>
+        </w:tc>
+      </w:tr>
+    </w:tbl>
+    <w:p/>
+    <w:p>
+      <w:pPr>
+        <w:pStyle w:val="Heading2"/>
+      </w:pPr>
+      <w:r>
+        <w:rPr>
+          <w:rFonts w:ascii="Calibri" w:hAnsi="Calibri"/>
+        </w:rPr>
         <w:t>10. Testing and Validation Summary</w:t>
       </w:r>
     </w:p>
@@ -1882,6 +2370,78 @@
           <w:b/>
         </w:rPr>
         <w:t>Validation Checks:</w:t>
+      </w:r>
+    </w:p>
+    <w:p>
+      <w:pPr>
+        <w:pStyle w:val="ListBullet"/>
+      </w:pPr>
+      <w:r>
+        <w:rPr>
+          <w:rFonts w:ascii="Calibri" w:hAnsi="Calibri"/>
+          <w:sz w:val="20"/>
+        </w:rPr>
+        <w:t>53/53 automated tests passing across all modules (unittest framework).</w:t>
+      </w:r>
+    </w:p>
+    <w:p>
+      <w:pPr>
+        <w:pStyle w:val="ListBullet"/>
+      </w:pPr>
+      <w:r>
+        <w:rPr>
+          <w:rFonts w:ascii="Calibri" w:hAnsi="Calibri"/>
+          <w:sz w:val="20"/>
+        </w:rPr>
+        <w:t>Chunking helpers tested: section splitting, size-bounded chunking, small-document bypass.</w:t>
+      </w:r>
+    </w:p>
+    <w:p>
+      <w:pPr>
+        <w:pStyle w:val="ListBullet"/>
+      </w:pPr>
+      <w:r>
+        <w:rPr>
+          <w:rFonts w:ascii="Calibri" w:hAnsi="Calibri"/>
+          <w:sz w:val="20"/>
+        </w:rPr>
+        <w:t>Merge logic tested: scalar first-wins, list deduplication, nested skill/keyword dicts.</w:t>
+      </w:r>
+    </w:p>
+    <w:p>
+      <w:pPr>
+        <w:pStyle w:val="ListBullet"/>
+      </w:pPr>
+      <w:r>
+        <w:rPr>
+          <w:rFonts w:ascii="Calibri" w:hAnsi="Calibri"/>
+          <w:sz w:val="20"/>
+        </w:rPr>
+        <w:t>Multi-chunk LLM flows tested with content-aware mocks in extractor and parser.</w:t>
+      </w:r>
+    </w:p>
+    <w:p>
+      <w:pPr>
+        <w:pStyle w:val="ListBullet"/>
+      </w:pPr>
+      <w:r>
+        <w:rPr>
+          <w:rFonts w:ascii="Calibri" w:hAnsi="Calibri"/>
+          <w:sz w:val="20"/>
+        </w:rPr>
+        <w:t>N-gram phrase detection verified: curated phrases ranked above single tokens.</w:t>
+      </w:r>
+    </w:p>
+    <w:p>
+      <w:pPr>
+        <w:pStyle w:val="ListBullet"/>
+      </w:pPr>
+      <w:r>
+        <w:rPr>
+          <w:rFonts w:ascii="Calibri" w:hAnsi="Calibri"/>
+          <w:sz w:val="20"/>
+        </w:rPr>
+        <w:t>Frequency-weighted (TF) keyword selection verified: most_common(30) returns highest-frequency terms.</w:t>
       </w:r>
     </w:p>
     <w:p>
@@ -1929,31 +2489,7 @@
           <w:rFonts w:ascii="Calibri" w:hAnsi="Calibri"/>
           <w:sz w:val="20"/>
         </w:rPr>
-        <w:t>Cross-platform report generation validated for Linux execution.</w:t>
-      </w:r>
-    </w:p>
-    <w:p>
-      <w:pPr>
-        <w:pStyle w:val="ListBullet"/>
-      </w:pPr>
-      <w:r>
-        <w:rPr>
-          <w:rFonts w:ascii="Calibri" w:hAnsi="Calibri"/>
-          <w:sz w:val="20"/>
-        </w:rPr>
-        <w:t>Module-level functionality verified for extractor, parser, matcher, generator, and reviser.</w:t>
-      </w:r>
-    </w:p>
-    <w:p>
-      <w:pPr>
-        <w:pStyle w:val="ListBullet"/>
-      </w:pPr>
-      <w:r>
-        <w:rPr>
-          <w:rFonts w:ascii="Calibri" w:hAnsi="Calibri"/>
-          <w:sz w:val="20"/>
-        </w:rPr>
-        <w:t>Error handling pathways tested for missing inputs and parsing edge cases.</w:t>
+        <w:t>Error handling pathways tested for missing inputs, empty files, and invalid JSON responses.</w:t>
       </w:r>
     </w:p>
     <w:p>
@@ -1974,7 +2510,7 @@
           <w:rFonts w:ascii="Calibri" w:hAnsi="Calibri"/>
           <w:sz w:val="20"/>
         </w:rPr>
-        <w:t>Resume extraction quality: robust on structured and semi-structured resumes.</w:t>
+        <w:t>Test suite: 53 tests, 0 failures, 0 errors, 0 skipped.</w:t>
       </w:r>
     </w:p>
     <w:p>
@@ -1986,7 +2522,31 @@
           <w:rFonts w:ascii="Calibri" w:hAnsi="Calibri"/>
           <w:sz w:val="20"/>
         </w:rPr>
-        <w:t>Generation turnaround: interactive workflow maintained for practical usage.</w:t>
+        <w:t>Resume extraction: robust on structured and semi-structured resumes; auto-chunks large inputs.</w:t>
+      </w:r>
+    </w:p>
+    <w:p>
+      <w:pPr>
+        <w:pStyle w:val="ListBullet"/>
+      </w:pPr>
+      <w:r>
+        <w:rPr>
+          <w:rFonts w:ascii="Calibri" w:hAnsi="Calibri"/>
+          <w:sz w:val="20"/>
+        </w:rPr>
+        <w:t>Keyword ranking: frequency-weighted top-30 selection improves ATS precision over position-based selection.</w:t>
+      </w:r>
+    </w:p>
+    <w:p>
+      <w:pPr>
+        <w:pStyle w:val="ListBullet"/>
+      </w:pPr>
+      <w:r>
+        <w:rPr>
+          <w:rFonts w:ascii="Calibri" w:hAnsi="Calibri"/>
+          <w:sz w:val="20"/>
+        </w:rPr>
+        <w:t>Multi-word phrase matching: 17 technical phrases detected and frequency-weighted correctly.</w:t>
       </w:r>
     </w:p>
     <w:p>
@@ -2035,7 +2595,7 @@
           <w:rFonts w:ascii="Calibri" w:hAnsi="Calibri"/>
           <w:b/>
         </w:rPr>
-        <w:t>Status: FULLY COMPLETE AND OPERATIONAL</w:t>
+        <w:t>Status: FULLY COMPLETE AND OPERATIONAL — ALL THREE CHUNKING PRIORITIES IMPLEMENTED</w:t>
       </w:r>
     </w:p>
     <w:p>
@@ -2071,7 +2631,7 @@
           <w:rFonts w:ascii="Calibri" w:hAnsi="Calibri"/>
           <w:sz w:val="20"/>
         </w:rPr>
-        <w:t>Production-ready deployment</w:t>
+        <w:t>Production-ready deployment with comprehensive error handling</w:t>
       </w:r>
     </w:p>
     <w:p>
@@ -2083,7 +2643,7 @@
           <w:rFonts w:ascii="Calibri" w:hAnsi="Calibri"/>
           <w:sz w:val="20"/>
         </w:rPr>
-        <w:t>Semantic similarity matching integrated in matcher.py and ats_checker.py</w:t>
+        <w:t>Priority 1: Frequency-weighted (TF) keyword selection — Counter.most_common(30) in matcher.py and ats_checker.py</w:t>
       </w:r>
     </w:p>
     <w:p>
@@ -2095,7 +2655,7 @@
           <w:rFonts w:ascii="Calibri" w:hAnsi="Calibri"/>
           <w:sz w:val="20"/>
         </w:rPr>
-        <w:t>Improved related-skill detection beyond exact keyword overlap</w:t>
+        <w:t>Priority 2: Curated n-gram phrase detection — 17 technical phrases with frequency preservation</w:t>
       </w:r>
     </w:p>
     <w:p>
@@ -2107,7 +2667,43 @@
           <w:rFonts w:ascii="Calibri" w:hAnsi="Calibri"/>
           <w:sz w:val="20"/>
         </w:rPr>
-        <w:t>Cross-platform report and resume export support</w:t>
+        <w:t>Priority 3: Threshold-based section-aware document chunking with structured merge in extractor.py and parser.py</w:t>
+      </w:r>
+    </w:p>
+    <w:p>
+      <w:pPr>
+        <w:pStyle w:val="ListBullet"/>
+      </w:pPr>
+      <w:r>
+        <w:rPr>
+          <w:rFonts w:ascii="Calibri" w:hAnsi="Calibri"/>
+          <w:sz w:val="20"/>
+        </w:rPr>
+        <w:t>Semantic similarity matching integrated for profile-job matching and ATS keyword analysis</w:t>
+      </w:r>
+    </w:p>
+    <w:p>
+      <w:pPr>
+        <w:pStyle w:val="ListBullet"/>
+      </w:pPr>
+      <w:r>
+        <w:rPr>
+          <w:rFonts w:ascii="Calibri" w:hAnsi="Calibri"/>
+          <w:sz w:val="20"/>
+        </w:rPr>
+        <w:t>53/53 automated tests passing including dedicated chunking and merge coverage</w:t>
+      </w:r>
+    </w:p>
+    <w:p>
+      <w:pPr>
+        <w:pStyle w:val="ListBullet"/>
+      </w:pPr>
+      <w:r>
+        <w:rPr>
+          <w:rFonts w:ascii="Calibri" w:hAnsi="Calibri"/>
+          <w:sz w:val="20"/>
+        </w:rPr>
+        <w:t>Cross-platform report and resume export support (PDF/DOCX)</w:t>
       </w:r>
     </w:p>
     <w:p>
@@ -2199,7 +2795,43 @@
           <w:rFonts w:ascii="Calibri" w:hAnsi="Calibri"/>
           <w:sz w:val="20"/>
         </w:rPr>
-        <w:t>Modular, maintainable architecture</w:t>
+        <w:t>Frequency-weighted keyword selection and curated n-gram phrase detection</w:t>
+      </w:r>
+    </w:p>
+    <w:p>
+      <w:pPr>
+        <w:pStyle w:val="ListBullet"/>
+      </w:pPr>
+      <w:r>
+        <w:rPr>
+          <w:rFonts w:ascii="Calibri" w:hAnsi="Calibri"/>
+          <w:sz w:val="20"/>
+        </w:rPr>
+        <w:t>Threshold-based document chunking with section-aware splitting and structured merge</w:t>
+      </w:r>
+    </w:p>
+    <w:p>
+      <w:pPr>
+        <w:pStyle w:val="ListBullet"/>
+      </w:pPr>
+      <w:r>
+        <w:rPr>
+          <w:rFonts w:ascii="Calibri" w:hAnsi="Calibri"/>
+          <w:sz w:val="20"/>
+        </w:rPr>
+        <w:t>Comprehensive 53-test suite covering edge cases, error handling, and chunking logic</w:t>
+      </w:r>
+    </w:p>
+    <w:p>
+      <w:pPr>
+        <w:pStyle w:val="ListBullet"/>
+      </w:pPr>
+      <w:r>
+        <w:rPr>
+          <w:rFonts w:ascii="Calibri" w:hAnsi="Calibri"/>
+          <w:sz w:val="20"/>
+        </w:rPr>
+        <w:t>Modular, maintainable architecture with environment-variable tunable chunking thresholds</w:t>
       </w:r>
     </w:p>
     <w:p>

</xml_diff>